<commit_message>
v2 retrain sonuçları: 73k satır, AUC 0.8452 (eski sızıntılıdan yüksek), isotonic ECE→0, Benter blend katsayıları
- Model karşılaştırma + ablation raporları yeni sayılarla (ort. ΔAUC ~0.024)
- Kalibrasyon raporu ham/isotonic önce-sonra karşılaştırması gösteriyor
- Backtest: model 6 bahis türünün 5'inde piyasadan anlamlı önde (Ganyan +6.7pp, p≈1e-31)
- Bildiri v2 anlatı+tablolar v2 sayılarıyla yeniden üretildi
- Stage 4: ablation OOF ayrı CSV'ye dump edilir (blend doğrulaması için)
- Retrain monitor: ablation da --dump-oof ile koşar
- RAPOR.md §11.3: v2 yeniden eğitim sonuç tablosu
</commit_message>
<xml_diff>
--- a/KollektifÖğrenme-Ganyan-v2.docx
+++ b/KollektifÖğrenme-Ganyan-v2.docx
@@ -453,7 +453,7 @@
                 <w:i w:val="0"/>
                 <w:sz w:val="20"/>
               </w:rPr>
-              <w:t>Yapay zeka teknolojileri spor veri analitiğinde önemli ilerlemeler sağlamasına rağmen, at yarışı tahmininde sızıntısız (leakage-free) doğrulama ve istatistiksel anlamlılık testleriyle desteklenmiş çok boyutlu çalışmalar sınırlı kalmıştır. Bu çalışmada, Türkiye Jokey Kulübü (TJK) bünyesindeki profesyonel yerli at yarışlarında birinciyi (Is_Winner) ve ilk üçü (Is_Top3) tahmin etmek amacıyla 9 farklı makine öğrenmesi/topluluk modelinin performansı, ileri-zincirli zaman-serisi çapraz doğrulaması (TimeSeriesSplit) ile sızıntısız biçimde karşılaştırılmıştır. 21.648 yerli yarış kaydı (2.199 yarış, 127 gün) üzerinde Optuna ile optimize edilen modellerden, birinci tahmininde CatBoost en yüksek ayırt ediciliğe (AUC=0.8412), StackingEnsemble en yüksek pratik getiriye (P@1=%39.9, Değer Bahsi ROI=+%86.8) ulaşmıştır; tabela tahmininde ise XGBoost (AUC=0.8158, P@1=%73.2, P@3=%96.8) öne çıkmıştır. Piyasa sinyali (Ganyan oranı) çıkarıldığında AUC'deki ortalama düşüş yalnızca 0.0137-0.0222 olup, modelin gücünün büyük ölçüde piyasadan bağımsız özelliklerden geldiğini göstermiştir. Modelin piyasaya karşı seçim isabeti, McNemar testiyle altı bahis türünün tümünde istatistiksel olarak anlamlı bulunmuştur (Ganyan: +8.1 puan, p=1.6×10⁻¹⁶). Kalibrasyon analizi, kazanan olasılıklarının neredeyse kusursuz (ECE=0.0054), tabela olasılıklarının ise sınıf-dengeleme kaynaklı aşırı güvenli (ECE=0.3018) olduğunu ortaya koymuştur.</w:t>
+              <w:t>Yapay zeka teknolojileri spor veri analitiğinde önemli ilerlemeler sağlamasına rağmen, at yarışı tahmininde sızıntısız (leakage-free) doğrulama ve istatistiksel anlamlılık testleriyle desteklenmiş çok boyutlu çalışmalar sınırlı kalmıştır. Bu çalışmada, Türkiye Jokey Kulübü (TJK) bünyesindeki profesyonel yerli at yarışlarında birinciyi (Is_Winner) ve ilk üçü (Is_Top3) tahmin etmek amacıyla 9 farklı makine öğrenmesi/topluluk modelinin performansı, ileri-zincirli zaman-serisi çapraz doğrulaması (TimeSeriesSplit) ile sızıntısız biçimde karşılaştırılmıştır. 73.036 yerli yarış kaydı (7.303 yarış, 432 gün) üzerinde Optuna ile optimize edilen modellerden, birinci tahmininde CatBoost en yüksek ayırt ediciliğe (AUC=0.8452), StackingEnsemble en yüksek pratik getiriye (P@1=%40.6, Değer Bahsi ROI=+%94.3) ulaşmıştır; tabela tahmininde ise StackingEnsemble (AUC=0.8200, P@1=%73.3, P@3=%96.4) öne çıkmıştır. Piyasa sinyali (Ganyan oranı) çıkarıldığında AUC'deki ortalama düşüş yalnızca 0.0227-0.0252 olup, modelin gücünün büyük ölçüde piyasadan bağımsız özelliklerden geldiğini göstermiştir. Modelin piyasaya karşı seçim isabeti, McNemar testiyle altı bahis türünün beşinde istatistiksel olarak anlamlı bulunmuştur (Ganyan: +6.7 puan, p=9.6×10⁻³²). Kalibrasyon analizi, kazanan olasılıklarının neredeyse kusursuz (ECE=0.0075), tabela olasılıklarının ise sınıf-dengeleme kaynaklı aşırı güvenli (ECE=0.1340) olduğunu ortaya koymuş; üretim zincirine eklenen isotonic kalibrasyonla her iki hedefte ECE sıfıra indirilmiştir.</w:t>
             </w:r>
           </w:p>
         </w:tc>
@@ -547,7 +547,7 @@
           <w:i w:val="0"/>
           <w:sz w:val="24"/>
         </w:rPr>
-        <w:t>Bu çalışma, TJK (Türkiye Jokey Kulübü) veritabanında yer alan profesyonel yerli at yarışlarında birinciyi (Is_Winner) ve tabelaya ilk 3 bağlamında girmeyi (Is_Top3) tahmin etmek üzere makine öğrenmesi temelli, sızıntısız (leakage-free) bir altyapı oluşturmayı hedeflemektedir. Bu amaç doğrultusunda 1 yıllık süre zarfında kaydedilen 21.648 veri satırından (2.199 yarış, 127 yarış günü) oluşan bir set işlenmiştir. Çalışmanın temel amacı; atların idman dereceleri, geçmiş anne-baba kazanma oranları (sızıntısız hedef kodlamasıyla hesaplanmış), göreceli sıklet ve göreceli handikap puanları gibi özellik mühendisliği yöntemleriyle yapılandırılmış setler üzerinde 9 farklı makine öğrenmesi/topluluk modelinin performans karşılaştırmasını sunmaktır. Çalışma ayrıca üç ek doğrulama katmanı eklemektedir: (i) piyasa sinyalinin (Ganyan oranı) modele katkısını ayrıştırmak için ablasyon analizi, (ii) tahmin olasılıklarının gerçek frekanslarla örtüşüp örtüşmediğini ölçen kalibrasyon analizi (Brier/ECE), ve (iii) modelin piyasaya karşı bahis seçimi isabetinin şans eseri olup olmadığını test eden McNemar anlamlılık testi. Bu sayede genel bahis kitlelerinin algılarından (Ganyan Baseline) kaynaklı kör bahis risklerinin giderilmesi ve doğruluk payı yüksek, istatistiksel olarak savunulabilir karar mekanizmalarının tesis edilmesi öngörülmektedir.</w:t>
+        <w:t>Bu çalışma, TJK (Türkiye Jokey Kulübü) veritabanında yer alan profesyonel yerli at yarışlarında birinciyi (Is_Winner) ve tabelaya ilk 3 bağlamında girmeyi (Is_Top3) tahmin etmek üzere makine öğrenmesi temelli, sızıntısız (leakage-free) bir altyapı oluşturmayı hedeflemektedir. Bu amaç doğrultusunda 14 aylık süre zarfında kaydedilen 73.036 veri satırından (7.303 yarış, 432 yarış günü) oluşan bir set işlenmiştir. Çalışmanın temel amacı; atların idman dereceleri, geçmiş anne-baba kazanma oranları (sızıntısız hedef kodlamasıyla hesaplanmış), göreceli sıklet ve göreceli handikap puanları gibi özellik mühendisliği yöntemleriyle yapılandırılmış setler üzerinde 9 farklı makine öğrenmesi/topluluk modelinin performans karşılaştırmasını sunmaktır. Çalışma ayrıca üç ek doğrulama katmanı eklemektedir: (i) piyasa sinyalinin (Ganyan oranı) modele katkısını ayrıştırmak için ablasyon analizi, (ii) tahmin olasılıklarının gerçek frekanslarla örtüşüp örtüşmediğini ölçen kalibrasyon analizi (Brier/ECE), ve (iii) modelin piyasaya karşı bahis seçimi isabetinin şans eseri olup olmadığını test eden McNemar anlamlılık testi. Bu sayede genel bahis kitlelerinin algılarından (Ganyan Baseline) kaynaklı kör bahis risklerinin giderilmesi ve doğruluk payı yüksek, istatistiksel olarak savunulabilir karar mekanizmalarının tesis edilmesi öngörülmektedir.</w:t>
       </w:r>
     </w:p>
     <w:p>
@@ -592,7 +592,7 @@
           <w:i w:val="0"/>
           <w:sz w:val="24"/>
         </w:rPr>
-        <w:t>Çalışmanın ham verisi, bağımsız bir şekilde geliştirilen çok aşamalı veri kazıma (Web Scraping) otomasyonları vasıtasıyla derlenmiştir. Nisan 2025 ile Mart 2026 tarihleri arasında gerçekleşen koşu verileri taranmış, idman verisine ulaşılamayan dış yarışlar filtrelenmiştir. Sonuç itibarıyla tamamı yerli atların bulunduğu 2.199 yarışlık, yüksek sinyal-gürültü oranına sahip 21.648 veri noktalı bir ana veri setine erişilmiştir. Kategorik değişkenler (hedef sızıntısı - data leakage engellenerek) geçmiş kümülatif başarılara oranlanmış, aykırı veya NaN barındıran satırlar sistemli bir şekilde impute edilmiş (doldurulmuş) veya atılmıştır.</w:t>
+        <w:t>Çalışmanın ham verisi, bağımsız bir şekilde geliştirilen çok aşamalı veri kazıma (Web Scraping) otomasyonları vasıtasıyla derlenmiştir. Nisan 2025 ile Haziran 2026 tarihleri arasında gerçekleşen koşu verileri taranmış, idman verisine ulaşılamayan dış yarışlar filtrelenmiştir. Sonuç itibarıyla tamamı yerli atların bulunduğu 7.303 yarışlık, yüksek sinyal-gürültü oranına sahip 73.036 veri noktalı bir ana veri setine erişilmiştir. Kategorik değişkenler (hedef sızıntısı - data leakage engellenerek) geçmiş kümülatif başarılara oranlanmış, aykırı veya NaN barındıran satırlar sistemli bir şekilde impute edilmiş (doldurulmuş) veya atılmıştır.</w:t>
       </w:r>
     </w:p>
     <w:tbl>
@@ -2144,7 +2144,7 @@
           <w:i w:val="0"/>
           <w:sz w:val="24"/>
         </w:rPr>
-        <w:t>Baseline (referans) stratejisinde, piyasadaki genel kanının tespit ettiği en popüler atın yarışı kazanma ihtimali (P@1 - Doğruluk) %34.3, bahis bazında karşılığı ise -%26.2 (yatırım zararı) olarak ölçülmüştür. Sızıntısız TimeSeriesSplit değerlendirmesiyle elde edilen makine öğrenmesi sonuçları bu referansın belirgin biçimde üzerindedir (Tablo 3). En yüksek ayırt edicilik (AUC) skoruna CatBoost (0.8412) ulaşmış; nihai getiri ve sıra-1 isabet dengesinde ise StackingEnsemble (P@1=%39.9, Değer Bahsi ROI=+%86.8) üretim (production) modeli olarak belirlenmiştir.</w:t>
+        <w:t>Baseline (referans) stratejisinde, piyasadaki genel kanının tespit ettiği en popüler atın yarışı kazanma ihtimali (P@1 - Doğruluk) %35.3, bahis bazında karşılığı ise -%27.1 (yatırım zararı) olarak ölçülmüştür. Sızıntısız TimeSeriesSplit değerlendirmesiyle elde edilen makine öğrenmesi sonuçları bu referansın belirgin biçimde üzerindedir (Tablo 3). En yüksek ayırt edicilik (AUC) skoruna CatBoost (0.8452) ulaşmış; nihai getiri ve sıra-1 isabet dengesinde ise StackingEnsemble (P@1=%40.6, Değer Bahsi ROI=+%94.3) üretim (production) modeli olarak belirlenmiştir.</w:t>
       </w:r>
     </w:p>
     <w:tbl>
@@ -2308,7 +2308,7 @@
                 <w:i w:val="0"/>
                 <w:sz w:val="20"/>
               </w:rPr>
-              <w:t>0.8412</w:t>
+              <w:t>0.8452</w:t>
             </w:r>
           </w:p>
         </w:tc>
@@ -2329,7 +2329,7 @@
                 <w:i w:val="0"/>
                 <w:sz w:val="20"/>
               </w:rPr>
-              <w:t>%39.1</w:t>
+              <w:t>%41.8</w:t>
             </w:r>
           </w:p>
         </w:tc>
@@ -2350,7 +2350,7 @@
                 <w:i w:val="0"/>
                 <w:sz w:val="20"/>
               </w:rPr>
-              <w:t>+%11.1</w:t>
+              <w:t>+%19.3</w:t>
             </w:r>
           </w:p>
         </w:tc>
@@ -2373,7 +2373,7 @@
                 <w:i w:val="0"/>
                 <w:sz w:val="20"/>
               </w:rPr>
-              <w:t>XGBoost</w:t>
+              <w:t>VotingEnsemble</w:t>
             </w:r>
           </w:p>
         </w:tc>
@@ -2394,7 +2394,7 @@
                 <w:i w:val="0"/>
                 <w:sz w:val="20"/>
               </w:rPr>
-              <w:t>0.8403</w:t>
+              <w:t>0.8417</w:t>
             </w:r>
           </w:p>
         </w:tc>
@@ -2415,7 +2415,7 @@
                 <w:i w:val="0"/>
                 <w:sz w:val="20"/>
               </w:rPr>
-              <w:t>%39.6</w:t>
+              <w:t>%41.2</w:t>
             </w:r>
           </w:p>
         </w:tc>
@@ -2436,7 +2436,7 @@
                 <w:i w:val="0"/>
                 <w:sz w:val="20"/>
               </w:rPr>
-              <w:t>+%30.0</w:t>
+              <w:t>+%17.0</w:t>
             </w:r>
           </w:p>
         </w:tc>
@@ -2459,7 +2459,7 @@
                 <w:i w:val="0"/>
                 <w:sz w:val="20"/>
               </w:rPr>
-              <w:t>StackingEnsemble</w:t>
+              <w:t>LightGBM</w:t>
             </w:r>
           </w:p>
         </w:tc>
@@ -2480,7 +2480,7 @@
                 <w:i w:val="0"/>
                 <w:sz w:val="20"/>
               </w:rPr>
-              <w:t>0.8398</w:t>
+              <w:t>0.8410</w:t>
             </w:r>
           </w:p>
         </w:tc>
@@ -2501,7 +2501,7 @@
                 <w:i w:val="0"/>
                 <w:sz w:val="20"/>
               </w:rPr>
-              <w:t>%39.9</w:t>
+              <w:t>%40.8</w:t>
             </w:r>
           </w:p>
         </w:tc>
@@ -2522,7 +2522,7 @@
                 <w:i w:val="0"/>
                 <w:sz w:val="20"/>
               </w:rPr>
-              <w:t>+%86.8</w:t>
+              <w:t>+%17.4</w:t>
             </w:r>
           </w:p>
         </w:tc>
@@ -2545,7 +2545,7 @@
                 <w:i w:val="0"/>
                 <w:sz w:val="20"/>
               </w:rPr>
-              <w:t>LightGBM</w:t>
+              <w:t>XGBoost</w:t>
             </w:r>
           </w:p>
         </w:tc>
@@ -2566,7 +2566,7 @@
                 <w:i w:val="0"/>
                 <w:sz w:val="20"/>
               </w:rPr>
-              <w:t>0.8393</w:t>
+              <w:t>0.8404</w:t>
             </w:r>
           </w:p>
         </w:tc>
@@ -2587,7 +2587,7 @@
                 <w:i w:val="0"/>
                 <w:sz w:val="20"/>
               </w:rPr>
-              <w:t>%38.5</w:t>
+              <w:t>%41.1</w:t>
             </w:r>
           </w:p>
         </w:tc>
@@ -2608,7 +2608,7 @@
                 <w:i w:val="0"/>
                 <w:sz w:val="20"/>
               </w:rPr>
-              <w:t>+%14.5</w:t>
+              <w:t>+%18.6</w:t>
             </w:r>
           </w:p>
         </w:tc>
@@ -2631,7 +2631,7 @@
                 <w:i w:val="0"/>
                 <w:sz w:val="20"/>
               </w:rPr>
-              <w:t>VotingEnsemble</w:t>
+              <w:t>StackingEnsemble</w:t>
             </w:r>
           </w:p>
         </w:tc>
@@ -2652,7 +2652,7 @@
                 <w:i w:val="0"/>
                 <w:sz w:val="20"/>
               </w:rPr>
-              <w:t>0.8377</w:t>
+              <w:t>0.8391</w:t>
             </w:r>
           </w:p>
         </w:tc>
@@ -2673,7 +2673,7 @@
                 <w:i w:val="0"/>
                 <w:sz w:val="20"/>
               </w:rPr>
-              <w:t>%38.4</w:t>
+              <w:t>%40.6</w:t>
             </w:r>
           </w:p>
         </w:tc>
@@ -2694,7 +2694,7 @@
                 <w:i w:val="0"/>
                 <w:sz w:val="20"/>
               </w:rPr>
-              <w:t>+%13.4</w:t>
+              <w:t>+%94.3</w:t>
             </w:r>
           </w:p>
         </w:tc>
@@ -2717,7 +2717,7 @@
                 <w:i w:val="0"/>
                 <w:sz w:val="20"/>
               </w:rPr>
-              <w:t>GradientBoosting</w:t>
+              <w:t>BaggingLGBM</w:t>
             </w:r>
           </w:p>
         </w:tc>
@@ -2738,7 +2738,7 @@
                 <w:i w:val="0"/>
                 <w:sz w:val="20"/>
               </w:rPr>
-              <w:t>0.8361</w:t>
+              <w:t>0.8387</w:t>
             </w:r>
           </w:p>
         </w:tc>
@@ -2759,7 +2759,7 @@
                 <w:i w:val="0"/>
                 <w:sz w:val="20"/>
               </w:rPr>
-              <w:t>%39.1</w:t>
+              <w:t>%40.4</w:t>
             </w:r>
           </w:p>
         </w:tc>
@@ -2780,7 +2780,7 @@
                 <w:i w:val="0"/>
                 <w:sz w:val="20"/>
               </w:rPr>
-              <w:t>+%88.3</w:t>
+              <w:t>+%16.6</w:t>
             </w:r>
           </w:p>
         </w:tc>
@@ -2803,7 +2803,7 @@
                 <w:i w:val="0"/>
                 <w:sz w:val="20"/>
               </w:rPr>
-              <w:t>LogisticRegression</w:t>
+              <w:t>GradientBoosting</w:t>
             </w:r>
           </w:p>
         </w:tc>
@@ -2824,7 +2824,7 @@
                 <w:i w:val="0"/>
                 <w:sz w:val="20"/>
               </w:rPr>
-              <w:t>0.8332</w:t>
+              <w:t>0.8324</w:t>
             </w:r>
           </w:p>
         </w:tc>
@@ -2845,7 +2845,7 @@
                 <w:i w:val="0"/>
                 <w:sz w:val="20"/>
               </w:rPr>
-              <w:t>%38.7</w:t>
+              <w:t>%40.4</w:t>
             </w:r>
           </w:p>
         </w:tc>
@@ -2866,7 +2866,7 @@
                 <w:i w:val="0"/>
                 <w:sz w:val="20"/>
               </w:rPr>
-              <w:t>+%24.7</w:t>
+              <w:t>+%60.2</w:t>
             </w:r>
           </w:p>
         </w:tc>
@@ -2889,7 +2889,7 @@
                 <w:i w:val="0"/>
                 <w:sz w:val="20"/>
               </w:rPr>
-              <w:t>RandomForest</w:t>
+              <w:t>LogisticRegression</w:t>
             </w:r>
           </w:p>
         </w:tc>
@@ -2910,7 +2910,7 @@
                 <w:i w:val="0"/>
                 <w:sz w:val="20"/>
               </w:rPr>
-              <w:t>0.8273</w:t>
+              <w:t>0.8243</w:t>
             </w:r>
           </w:p>
         </w:tc>
@@ -2931,7 +2931,7 @@
                 <w:i w:val="0"/>
                 <w:sz w:val="20"/>
               </w:rPr>
-              <w:t>%39.0</w:t>
+              <w:t>%38.6</w:t>
             </w:r>
           </w:p>
         </w:tc>
@@ -2952,7 +2952,7 @@
                 <w:i w:val="0"/>
                 <w:sz w:val="20"/>
               </w:rPr>
-              <w:t>+%3.4</w:t>
+              <w:t>+%8.6</w:t>
             </w:r>
           </w:p>
         </w:tc>
@@ -2975,7 +2975,7 @@
                 <w:i w:val="0"/>
                 <w:sz w:val="20"/>
               </w:rPr>
-              <w:t>BaggingLGBM</w:t>
+              <w:t>RandomForest</w:t>
             </w:r>
           </w:p>
         </w:tc>
@@ -2996,7 +2996,7 @@
                 <w:i w:val="0"/>
                 <w:sz w:val="20"/>
               </w:rPr>
-              <w:t>0.8272</w:t>
+              <w:t>0.8195</w:t>
             </w:r>
           </w:p>
         </w:tc>
@@ -3017,7 +3017,7 @@
                 <w:i w:val="0"/>
                 <w:sz w:val="20"/>
               </w:rPr>
-              <w:t>%38.0</w:t>
+              <w:t>%37.5</w:t>
             </w:r>
           </w:p>
         </w:tc>
@@ -3038,7 +3038,7 @@
                 <w:i w:val="0"/>
                 <w:sz w:val="20"/>
               </w:rPr>
-              <w:t>+%12.2</w:t>
+              <w:t>%-7.5</w:t>
             </w:r>
           </w:p>
         </w:tc>
@@ -3052,7 +3052,7 @@
       <w:r>
         <w:drawing>
           <wp:inline xmlns:a="http://schemas.openxmlformats.org/drawingml/2006/main" xmlns:pic="http://schemas.openxmlformats.org/drawingml/2006/picture">
-            <wp:extent cx="5040000" cy="1786020"/>
+            <wp:extent cx="5040000" cy="1786353"/>
             <wp:docPr id="1" name="Picture 1"/>
             <wp:cNvGraphicFramePr>
               <a:graphicFrameLocks noChangeAspect="1"/>
@@ -3073,7 +3073,7 @@
                   <pic:spPr>
                     <a:xfrm>
                       <a:off x="0" y="0"/>
-                      <a:ext cx="5040000" cy="1786020"/>
+                      <a:ext cx="5040000" cy="1786353"/>
                     </a:xfrm>
                     <a:prstGeom prst="rect"/>
                   </pic:spPr>
@@ -3126,7 +3126,7 @@
           <w:i w:val="0"/>
           <w:sz w:val="24"/>
         </w:rPr>
-        <w:t>Hedef değişkenin ilk üç sıra olarak ele alındığı model kümesinde isabet oranları belirgin biçimde yükselmiştir. Tablo 4'te görüldüğü üzere XGBoost modeli (AUC=0.8158, P@1=%73.2, P@3=%96.8) bu hedefin öncüsü konumundadır. Veride yalnızca kazanma (Ganyan) ödemesi bulunduğundan, plase/tabela finişine parasal getiri (ROI) atfetmek yanıltıcı olacağından bu hedef için ROI raporlanmamış, değerlendirme sıralama metrikleriyle (AUC, P@1, P@3) sınırlandırılmıştır.</w:t>
+        <w:t>Hedef değişkenin ilk üç sıra olarak ele alındığı model kümesinde isabet oranları belirgin biçimde yükselmiştir. Tablo 4'te görüldüğü üzere StackingEnsemble modeli (AUC=0.8200, P@1=%73.3, P@3=%96.4) ayırt edicilikte öncü konumdadır; bileşik skorla üretim modeli olarak VotingEnsemble (P@1=%73.4, P@3=%96.7) seçilmiştir. Veride yalnızca kazanma (Ganyan) ödemesi bulunduğundan, plase/tabela finişine parasal getiri (ROI) atfetmek yanıltıcı olacağından bu hedef için ROI raporlanmamış, değerlendirme sıralama metrikleriyle (AUC, P@1, P@3) sınırlandırılmıştır.</w:t>
       </w:r>
     </w:p>
     <w:tbl>
@@ -3269,7 +3269,7 @@
                 <w:i w:val="0"/>
                 <w:sz w:val="20"/>
               </w:rPr>
-              <w:t>XGBoost</w:t>
+              <w:t>StackingEnsemble</w:t>
             </w:r>
           </w:p>
         </w:tc>
@@ -3290,7 +3290,7 @@
                 <w:i w:val="0"/>
                 <w:sz w:val="20"/>
               </w:rPr>
-              <w:t>0.8158</w:t>
+              <w:t>0.8200</w:t>
             </w:r>
           </w:p>
         </w:tc>
@@ -3311,7 +3311,7 @@
                 <w:i w:val="0"/>
                 <w:sz w:val="20"/>
               </w:rPr>
-              <w:t>%73.2</w:t>
+              <w:t>%73.3</w:t>
             </w:r>
           </w:p>
         </w:tc>
@@ -3332,7 +3332,7 @@
                 <w:i w:val="0"/>
                 <w:sz w:val="20"/>
               </w:rPr>
-              <w:t>%96.8</w:t>
+              <w:t>%96.4</w:t>
             </w:r>
           </w:p>
         </w:tc>
@@ -3376,7 +3376,7 @@
                 <w:i w:val="0"/>
                 <w:sz w:val="20"/>
               </w:rPr>
-              <w:t>0.8149</w:t>
+              <w:t>0.8196</w:t>
             </w:r>
           </w:p>
         </w:tc>
@@ -3397,7 +3397,7 @@
                 <w:i w:val="0"/>
                 <w:sz w:val="20"/>
               </w:rPr>
-              <w:t>%71.4</w:t>
+              <w:t>%72.8</w:t>
             </w:r>
           </w:p>
         </w:tc>
@@ -3418,7 +3418,7 @@
                 <w:i w:val="0"/>
                 <w:sz w:val="20"/>
               </w:rPr>
-              <w:t>%96.9</w:t>
+              <w:t>%96.5</w:t>
             </w:r>
           </w:p>
         </w:tc>
@@ -3441,7 +3441,7 @@
                 <w:i w:val="0"/>
                 <w:sz w:val="20"/>
               </w:rPr>
-              <w:t>StackingEnsemble</w:t>
+              <w:t>CatBoost</w:t>
             </w:r>
           </w:p>
         </w:tc>
@@ -3462,7 +3462,7 @@
                 <w:i w:val="0"/>
                 <w:sz w:val="20"/>
               </w:rPr>
-              <w:t>0.8147</w:t>
+              <w:t>0.8195</w:t>
             </w:r>
           </w:p>
         </w:tc>
@@ -3483,7 +3483,7 @@
                 <w:i w:val="0"/>
                 <w:sz w:val="20"/>
               </w:rPr>
-              <w:t>%72.0</w:t>
+              <w:t>%73.1</w:t>
             </w:r>
           </w:p>
         </w:tc>
@@ -3504,7 +3504,7 @@
                 <w:i w:val="0"/>
                 <w:sz w:val="20"/>
               </w:rPr>
-              <w:t>%96.9</w:t>
+              <w:t>%96.4</w:t>
             </w:r>
           </w:p>
         </w:tc>
@@ -3527,7 +3527,7 @@
                 <w:i w:val="0"/>
                 <w:sz w:val="20"/>
               </w:rPr>
-              <w:t>CatBoost</w:t>
+              <w:t>VotingEnsemble</w:t>
             </w:r>
           </w:p>
         </w:tc>
@@ -3548,7 +3548,7 @@
                 <w:i w:val="0"/>
                 <w:sz w:val="20"/>
               </w:rPr>
-              <w:t>0.8146</w:t>
+              <w:t>0.8195</w:t>
             </w:r>
           </w:p>
         </w:tc>
@@ -3569,7 +3569,7 @@
                 <w:i w:val="0"/>
                 <w:sz w:val="20"/>
               </w:rPr>
-              <w:t>%73.0</w:t>
+              <w:t>%73.4</w:t>
             </w:r>
           </w:p>
         </w:tc>
@@ -3590,7 +3590,7 @@
                 <w:i w:val="0"/>
                 <w:sz w:val="20"/>
               </w:rPr>
-              <w:t>%96.8</w:t>
+              <w:t>%96.7</w:t>
             </w:r>
           </w:p>
         </w:tc>
@@ -3613,7 +3613,7 @@
                 <w:i w:val="0"/>
                 <w:sz w:val="20"/>
               </w:rPr>
-              <w:t>VotingEnsemble</w:t>
+              <w:t>XGBoost</w:t>
             </w:r>
           </w:p>
         </w:tc>
@@ -3634,7 +3634,7 @@
                 <w:i w:val="0"/>
                 <w:sz w:val="20"/>
               </w:rPr>
-              <w:t>0.8142</w:t>
+              <w:t>0.8194</w:t>
             </w:r>
           </w:p>
         </w:tc>
@@ -3655,7 +3655,7 @@
                 <w:i w:val="0"/>
                 <w:sz w:val="20"/>
               </w:rPr>
-              <w:t>%71.3</w:t>
+              <w:t>%73.0</w:t>
             </w:r>
           </w:p>
         </w:tc>
@@ -3676,7 +3676,7 @@
                 <w:i w:val="0"/>
                 <w:sz w:val="20"/>
               </w:rPr>
-              <w:t>%96.9</w:t>
+              <w:t>%96.7</w:t>
             </w:r>
           </w:p>
         </w:tc>
@@ -3699,7 +3699,7 @@
                 <w:i w:val="0"/>
                 <w:sz w:val="20"/>
               </w:rPr>
-              <w:t>GradientBoosting</w:t>
+              <w:t>BaggingLGBM</w:t>
             </w:r>
           </w:p>
         </w:tc>
@@ -3720,7 +3720,7 @@
                 <w:i w:val="0"/>
                 <w:sz w:val="20"/>
               </w:rPr>
-              <w:t>0.8126</w:t>
+              <w:t>0.8183</w:t>
             </w:r>
           </w:p>
         </w:tc>
@@ -3741,7 +3741,7 @@
                 <w:i w:val="0"/>
                 <w:sz w:val="20"/>
               </w:rPr>
-              <w:t>%72.1</w:t>
+              <w:t>%72.9</w:t>
             </w:r>
           </w:p>
         </w:tc>
@@ -3762,7 +3762,7 @@
                 <w:i w:val="0"/>
                 <w:sz w:val="20"/>
               </w:rPr>
-              <w:t>%97.0</w:t>
+              <w:t>%96.6</w:t>
             </w:r>
           </w:p>
         </w:tc>
@@ -3785,7 +3785,7 @@
                 <w:i w:val="0"/>
                 <w:sz w:val="20"/>
               </w:rPr>
-              <w:t>BaggingLGBM</w:t>
+              <w:t>GradientBoosting</w:t>
             </w:r>
           </w:p>
         </w:tc>
@@ -3806,7 +3806,7 @@
                 <w:i w:val="0"/>
                 <w:sz w:val="20"/>
               </w:rPr>
-              <w:t>0.8091</w:t>
+              <w:t>0.8104</w:t>
             </w:r>
           </w:p>
         </w:tc>
@@ -3827,7 +3827,7 @@
                 <w:i w:val="0"/>
                 <w:sz w:val="20"/>
               </w:rPr>
-              <w:t>%71.9</w:t>
+              <w:t>%72.2</w:t>
             </w:r>
           </w:p>
         </w:tc>
@@ -3848,7 +3848,7 @@
                 <w:i w:val="0"/>
                 <w:sz w:val="20"/>
               </w:rPr>
-              <w:t>%96.6</w:t>
+              <w:t>%96.3</w:t>
             </w:r>
           </w:p>
         </w:tc>
@@ -3892,7 +3892,7 @@
                 <w:i w:val="0"/>
                 <w:sz w:val="20"/>
               </w:rPr>
-              <w:t>0.8073</w:t>
+              <w:t>0.7983</w:t>
             </w:r>
           </w:p>
         </w:tc>
@@ -3913,7 +3913,7 @@
                 <w:i w:val="0"/>
                 <w:sz w:val="20"/>
               </w:rPr>
-              <w:t>%70.9</w:t>
+              <w:t>%71.0</w:t>
             </w:r>
           </w:p>
         </w:tc>
@@ -3934,7 +3934,7 @@
                 <w:i w:val="0"/>
                 <w:sz w:val="20"/>
               </w:rPr>
-              <w:t>%96.7</w:t>
+              <w:t>%96.1</w:t>
             </w:r>
           </w:p>
         </w:tc>
@@ -3978,7 +3978,7 @@
                 <w:i w:val="0"/>
                 <w:sz w:val="20"/>
               </w:rPr>
-              <w:t>0.7983</w:t>
+              <w:t>0.7913</w:t>
             </w:r>
           </w:p>
         </w:tc>
@@ -3999,7 +3999,7 @@
                 <w:i w:val="0"/>
                 <w:sz w:val="20"/>
               </w:rPr>
-              <w:t>%71.2</w:t>
+              <w:t>%70.2</w:t>
             </w:r>
           </w:p>
         </w:tc>
@@ -4020,7 +4020,7 @@
                 <w:i w:val="0"/>
                 <w:sz w:val="20"/>
               </w:rPr>
-              <w:t>%96.5</w:t>
+              <w:t>%95.9</w:t>
             </w:r>
           </w:p>
         </w:tc>
@@ -4034,7 +4034,7 @@
       <w:r>
         <w:drawing>
           <wp:inline xmlns:a="http://schemas.openxmlformats.org/drawingml/2006/main" xmlns:pic="http://schemas.openxmlformats.org/drawingml/2006/picture">
-            <wp:extent cx="5040000" cy="2690835"/>
+            <wp:extent cx="5040000" cy="2690079"/>
             <wp:docPr id="2" name="Picture 2"/>
             <wp:cNvGraphicFramePr>
               <a:graphicFrameLocks noChangeAspect="1"/>
@@ -4055,7 +4055,7 @@
                   <pic:spPr>
                     <a:xfrm>
                       <a:off x="0" y="0"/>
-                      <a:ext cx="5040000" cy="2690835"/>
+                      <a:ext cx="5040000" cy="2690079"/>
                     </a:xfrm>
                     <a:prstGeom prst="rect"/>
                   </pic:spPr>
@@ -4108,7 +4108,7 @@
           <w:i w:val="0"/>
           <w:sz w:val="24"/>
         </w:rPr>
-        <w:t>Ganyan_Sayi değişkeni ve türevleri çıkarıldığında, Is_Winner hedefinde ortalama AUC düşüşü +0.0137, Is_Top3 hedefinde +0.0222 olarak ölçülmüştür (Tablo 5-6, Şekil 3-4). Düşüşün küçüklüğü, modelin ayırt ediciliğinin büyük ölçüde piyasa fiyatlamasından değil; handikap, jokey/antrenör geçmişi, soy hattı ve idman verilerinden kaynaklandığını göstermektedir. Bu bulgu, modelin piyasa oranlarını yalnızca ezberlediği eleştirisini büyük ölçüde çürütmektedir.</w:t>
+        <w:t>Ganyan_Sayi değişkeni ve türevleri çıkarıldığında, Is_Winner hedefinde ortalama AUC düşüşü +0.0252, Is_Top3 hedefinde +0.0227 olarak ölçülmüştür (Tablo 5-6, Şekil 3-4). Düşüşün küçüklüğü, modelin ayırt ediciliğinin büyük ölçüde piyasa fiyatlamasından değil; handikap, jokey/antrenör geçmişi, soy hattı ve idman verilerinden kaynaklandığını göstermektedir. Bu bulgu, modelin piyasa oranlarını yalnızca ezberlediği eleştirisini büyük ölçüde çürütmektedir.</w:t>
       </w:r>
     </w:p>
     <w:tbl>
@@ -4338,7 +4338,7 @@
                 <w:i w:val="0"/>
                 <w:sz w:val="20"/>
               </w:rPr>
-              <w:t>0.8412</w:t>
+              <w:t>0.8452</w:t>
             </w:r>
           </w:p>
         </w:tc>
@@ -4359,7 +4359,7 @@
                 <w:i w:val="0"/>
                 <w:sz w:val="20"/>
               </w:rPr>
-              <w:t>0.8284</w:t>
+              <w:t>0.8218</w:t>
             </w:r>
           </w:p>
         </w:tc>
@@ -4380,7 +4380,7 @@
                 <w:i w:val="0"/>
                 <w:sz w:val="20"/>
               </w:rPr>
-              <w:t>+0.0128</w:t>
+              <w:t>+0.0234</w:t>
             </w:r>
           </w:p>
         </w:tc>
@@ -4401,7 +4401,7 @@
                 <w:i w:val="0"/>
                 <w:sz w:val="20"/>
               </w:rPr>
-              <w:t>%39.1</w:t>
+              <w:t>%41.8</w:t>
             </w:r>
           </w:p>
         </w:tc>
@@ -4422,7 +4422,7 @@
                 <w:i w:val="0"/>
                 <w:sz w:val="20"/>
               </w:rPr>
-              <w:t>%38.0</w:t>
+              <w:t>%40.4</w:t>
             </w:r>
           </w:p>
         </w:tc>
@@ -4443,7 +4443,7 @@
                 <w:i w:val="0"/>
                 <w:sz w:val="20"/>
               </w:rPr>
-              <w:t>+%1.1</w:t>
+              <w:t>+%1.4</w:t>
             </w:r>
           </w:p>
         </w:tc>
@@ -4466,7 +4466,7 @@
                 <w:i w:val="0"/>
                 <w:sz w:val="20"/>
               </w:rPr>
-              <w:t>XGBoost</w:t>
+              <w:t>VotingEnsemble</w:t>
             </w:r>
           </w:p>
         </w:tc>
@@ -4487,7 +4487,7 @@
                 <w:i w:val="0"/>
                 <w:sz w:val="20"/>
               </w:rPr>
-              <w:t>0.8403</w:t>
+              <w:t>0.8417</w:t>
             </w:r>
           </w:p>
         </w:tc>
@@ -4508,7 +4508,7 @@
                 <w:i w:val="0"/>
                 <w:sz w:val="20"/>
               </w:rPr>
-              <w:t>0.8297</w:t>
+              <w:t>0.8199</w:t>
             </w:r>
           </w:p>
         </w:tc>
@@ -4529,7 +4529,7 @@
                 <w:i w:val="0"/>
                 <w:sz w:val="20"/>
               </w:rPr>
-              <w:t>+0.0106</w:t>
+              <w:t>+0.0218</w:t>
             </w:r>
           </w:p>
         </w:tc>
@@ -4550,7 +4550,7 @@
                 <w:i w:val="0"/>
                 <w:sz w:val="20"/>
               </w:rPr>
-              <w:t>%39.6</w:t>
+              <w:t>%41.2</w:t>
             </w:r>
           </w:p>
         </w:tc>
@@ -4571,7 +4571,7 @@
                 <w:i w:val="0"/>
                 <w:sz w:val="20"/>
               </w:rPr>
-              <w:t>%38.4</w:t>
+              <w:t>%40.3</w:t>
             </w:r>
           </w:p>
         </w:tc>
@@ -4592,7 +4592,7 @@
                 <w:i w:val="0"/>
                 <w:sz w:val="20"/>
               </w:rPr>
-              <w:t>+%1.2</w:t>
+              <w:t>+%0.9</w:t>
             </w:r>
           </w:p>
         </w:tc>
@@ -4615,7 +4615,7 @@
                 <w:i w:val="0"/>
                 <w:sz w:val="20"/>
               </w:rPr>
-              <w:t>StackingEnsemble</w:t>
+              <w:t>LightGBM</w:t>
             </w:r>
           </w:p>
         </w:tc>
@@ -4636,7 +4636,7 @@
                 <w:i w:val="0"/>
                 <w:sz w:val="20"/>
               </w:rPr>
-              <w:t>0.8398</w:t>
+              <w:t>0.8410</w:t>
             </w:r>
           </w:p>
         </w:tc>
@@ -4657,7 +4657,7 @@
                 <w:i w:val="0"/>
                 <w:sz w:val="20"/>
               </w:rPr>
-              <w:t>0.8267</w:t>
+              <w:t>0.8201</w:t>
             </w:r>
           </w:p>
         </w:tc>
@@ -4678,7 +4678,7 @@
                 <w:i w:val="0"/>
                 <w:sz w:val="20"/>
               </w:rPr>
-              <w:t>+0.0131</w:t>
+              <w:t>+0.0209</w:t>
             </w:r>
           </w:p>
         </w:tc>
@@ -4699,7 +4699,7 @@
                 <w:i w:val="0"/>
                 <w:sz w:val="20"/>
               </w:rPr>
-              <w:t>%39.9</w:t>
+              <w:t>%40.8</w:t>
             </w:r>
           </w:p>
         </w:tc>
@@ -4720,7 +4720,7 @@
                 <w:i w:val="0"/>
                 <w:sz w:val="20"/>
               </w:rPr>
-              <w:t>%38.1</w:t>
+              <w:t>%40.3</w:t>
             </w:r>
           </w:p>
         </w:tc>
@@ -4741,7 +4741,7 @@
                 <w:i w:val="0"/>
                 <w:sz w:val="20"/>
               </w:rPr>
-              <w:t>+%1.7</w:t>
+              <w:t>+%0.6</w:t>
             </w:r>
           </w:p>
         </w:tc>
@@ -4764,7 +4764,7 @@
                 <w:i w:val="0"/>
                 <w:sz w:val="20"/>
               </w:rPr>
-              <w:t>LightGBM</w:t>
+              <w:t>XGBoost</w:t>
             </w:r>
           </w:p>
         </w:tc>
@@ -4785,7 +4785,7 @@
                 <w:i w:val="0"/>
                 <w:sz w:val="20"/>
               </w:rPr>
-              <w:t>0.8393</w:t>
+              <w:t>0.8404</w:t>
             </w:r>
           </w:p>
         </w:tc>
@@ -4806,7 +4806,7 @@
                 <w:i w:val="0"/>
                 <w:sz w:val="20"/>
               </w:rPr>
-              <w:t>0.8278</w:t>
+              <w:t>0.8189</w:t>
             </w:r>
           </w:p>
         </w:tc>
@@ -4827,7 +4827,7 @@
                 <w:i w:val="0"/>
                 <w:sz w:val="20"/>
               </w:rPr>
-              <w:t>+0.0115</w:t>
+              <w:t>+0.0215</w:t>
             </w:r>
           </w:p>
         </w:tc>
@@ -4848,7 +4848,7 @@
                 <w:i w:val="0"/>
                 <w:sz w:val="20"/>
               </w:rPr>
-              <w:t>%38.5</w:t>
+              <w:t>%41.1</w:t>
             </w:r>
           </w:p>
         </w:tc>
@@ -4869,7 +4869,7 @@
                 <w:i w:val="0"/>
                 <w:sz w:val="20"/>
               </w:rPr>
-              <w:t>%38.3</w:t>
+              <w:t>%38.9</w:t>
             </w:r>
           </w:p>
         </w:tc>
@@ -4890,7 +4890,7 @@
                 <w:i w:val="0"/>
                 <w:sz w:val="20"/>
               </w:rPr>
-              <w:t>+%0.2</w:t>
+              <w:t>+%2.2</w:t>
             </w:r>
           </w:p>
         </w:tc>
@@ -4913,7 +4913,7 @@
                 <w:i w:val="0"/>
                 <w:sz w:val="20"/>
               </w:rPr>
-              <w:t>VotingEnsemble</w:t>
+              <w:t>StackingEnsemble</w:t>
             </w:r>
           </w:p>
         </w:tc>
@@ -4934,7 +4934,7 @@
                 <w:i w:val="0"/>
                 <w:sz w:val="20"/>
               </w:rPr>
-              <w:t>0.8377</w:t>
+              <w:t>0.8391</w:t>
             </w:r>
           </w:p>
         </w:tc>
@@ -4955,7 +4955,7 @@
                 <w:i w:val="0"/>
                 <w:sz w:val="20"/>
               </w:rPr>
-              <w:t>0.8254</w:t>
+              <w:t>0.8183</w:t>
             </w:r>
           </w:p>
         </w:tc>
@@ -4976,7 +4976,7 @@
                 <w:i w:val="0"/>
                 <w:sz w:val="20"/>
               </w:rPr>
-              <w:t>+0.0123</w:t>
+              <w:t>+0.0208</w:t>
             </w:r>
           </w:p>
         </w:tc>
@@ -4997,7 +4997,7 @@
                 <w:i w:val="0"/>
                 <w:sz w:val="20"/>
               </w:rPr>
-              <w:t>%38.4</w:t>
+              <w:t>%40.6</w:t>
             </w:r>
           </w:p>
         </w:tc>
@@ -5018,7 +5018,7 @@
                 <w:i w:val="0"/>
                 <w:sz w:val="20"/>
               </w:rPr>
-              <w:t>%36.6</w:t>
+              <w:t>%39.7</w:t>
             </w:r>
           </w:p>
         </w:tc>
@@ -5039,7 +5039,7 @@
                 <w:i w:val="0"/>
                 <w:sz w:val="20"/>
               </w:rPr>
-              <w:t>+%1.8</w:t>
+              <w:t>+%1.0</w:t>
             </w:r>
           </w:p>
         </w:tc>
@@ -5062,7 +5062,7 @@
                 <w:i w:val="0"/>
                 <w:sz w:val="20"/>
               </w:rPr>
-              <w:t>GradientBoosting</w:t>
+              <w:t>BaggingLGBM</w:t>
             </w:r>
           </w:p>
         </w:tc>
@@ -5083,7 +5083,7 @@
                 <w:i w:val="0"/>
                 <w:sz w:val="20"/>
               </w:rPr>
-              <w:t>0.8361</w:t>
+              <w:t>0.8387</w:t>
             </w:r>
           </w:p>
         </w:tc>
@@ -5104,7 +5104,7 @@
                 <w:i w:val="0"/>
                 <w:sz w:val="20"/>
               </w:rPr>
-              <w:t>0.8231</w:t>
+              <w:t>0.8163</w:t>
             </w:r>
           </w:p>
         </w:tc>
@@ -5125,7 +5125,7 @@
                 <w:i w:val="0"/>
                 <w:sz w:val="20"/>
               </w:rPr>
-              <w:t>+0.0130</w:t>
+              <w:t>+0.0224</w:t>
             </w:r>
           </w:p>
         </w:tc>
@@ -5146,7 +5146,7 @@
                 <w:i w:val="0"/>
                 <w:sz w:val="20"/>
               </w:rPr>
-              <w:t>%39.1</w:t>
+              <w:t>%40.4</w:t>
             </w:r>
           </w:p>
         </w:tc>
@@ -5167,7 +5167,7 @@
                 <w:i w:val="0"/>
                 <w:sz w:val="20"/>
               </w:rPr>
-              <w:t>%36.6</w:t>
+              <w:t>%39.4</w:t>
             </w:r>
           </w:p>
         </w:tc>
@@ -5188,7 +5188,7 @@
                 <w:i w:val="0"/>
                 <w:sz w:val="20"/>
               </w:rPr>
-              <w:t>+%2.5</w:t>
+              <w:t>+%1.0</w:t>
             </w:r>
           </w:p>
         </w:tc>
@@ -5211,7 +5211,7 @@
                 <w:i w:val="0"/>
                 <w:sz w:val="20"/>
               </w:rPr>
-              <w:t>LogisticRegression</w:t>
+              <w:t>GradientBoosting</w:t>
             </w:r>
           </w:p>
         </w:tc>
@@ -5232,7 +5232,7 @@
                 <w:i w:val="0"/>
                 <w:sz w:val="20"/>
               </w:rPr>
-              <w:t>0.8332</w:t>
+              <w:t>0.8324</w:t>
             </w:r>
           </w:p>
         </w:tc>
@@ -5253,7 +5253,7 @@
                 <w:i w:val="0"/>
                 <w:sz w:val="20"/>
               </w:rPr>
-              <w:t>0.8189</w:t>
+              <w:t>0.8053</w:t>
             </w:r>
           </w:p>
         </w:tc>
@@ -5274,7 +5274,7 @@
                 <w:i w:val="0"/>
                 <w:sz w:val="20"/>
               </w:rPr>
-              <w:t>+0.0143</w:t>
+              <w:t>+0.0271</w:t>
             </w:r>
           </w:p>
         </w:tc>
@@ -5295,7 +5295,7 @@
                 <w:i w:val="0"/>
                 <w:sz w:val="20"/>
               </w:rPr>
-              <w:t>%38.7</w:t>
+              <w:t>%40.4</w:t>
             </w:r>
           </w:p>
         </w:tc>
@@ -5316,7 +5316,7 @@
                 <w:i w:val="0"/>
                 <w:sz w:val="20"/>
               </w:rPr>
-              <w:t>%36.2</w:t>
+              <w:t>%37.6</w:t>
             </w:r>
           </w:p>
         </w:tc>
@@ -5337,7 +5337,7 @@
                 <w:i w:val="0"/>
                 <w:sz w:val="20"/>
               </w:rPr>
-              <w:t>+%2.6</w:t>
+              <w:t>+%2.7</w:t>
             </w:r>
           </w:p>
         </w:tc>
@@ -5360,7 +5360,7 @@
                 <w:i w:val="0"/>
                 <w:sz w:val="20"/>
               </w:rPr>
-              <w:t>RandomForest</w:t>
+              <w:t>LogisticRegression</w:t>
             </w:r>
           </w:p>
         </w:tc>
@@ -5381,7 +5381,7 @@
                 <w:i w:val="0"/>
                 <w:sz w:val="20"/>
               </w:rPr>
-              <w:t>0.8273</w:t>
+              <w:t>0.8243</w:t>
             </w:r>
           </w:p>
         </w:tc>
@@ -5402,7 +5402,7 @@
                 <w:i w:val="0"/>
                 <w:sz w:val="20"/>
               </w:rPr>
-              <w:t>0.8030</w:t>
+              <w:t>0.7949</w:t>
             </w:r>
           </w:p>
         </w:tc>
@@ -5423,7 +5423,7 @@
                 <w:i w:val="0"/>
                 <w:sz w:val="20"/>
               </w:rPr>
-              <w:t>+0.0243</w:t>
+              <w:t>+0.0294</w:t>
             </w:r>
           </w:p>
         </w:tc>
@@ -5444,7 +5444,7 @@
                 <w:i w:val="0"/>
                 <w:sz w:val="20"/>
               </w:rPr>
-              <w:t>%39.0</w:t>
+              <w:t>%38.6</w:t>
             </w:r>
           </w:p>
         </w:tc>
@@ -5465,7 +5465,7 @@
                 <w:i w:val="0"/>
                 <w:sz w:val="20"/>
               </w:rPr>
-              <w:t>%34.7</w:t>
+              <w:t>%36.0</w:t>
             </w:r>
           </w:p>
         </w:tc>
@@ -5486,7 +5486,7 @@
                 <w:i w:val="0"/>
                 <w:sz w:val="20"/>
               </w:rPr>
-              <w:t>+%4.3</w:t>
+              <w:t>+%2.7</w:t>
             </w:r>
           </w:p>
         </w:tc>
@@ -5509,7 +5509,7 @@
                 <w:i w:val="0"/>
                 <w:sz w:val="20"/>
               </w:rPr>
-              <w:t>BaggingLGBM</w:t>
+              <w:t>RandomForest</w:t>
             </w:r>
           </w:p>
         </w:tc>
@@ -5530,7 +5530,7 @@
                 <w:i w:val="0"/>
                 <w:sz w:val="20"/>
               </w:rPr>
-              <w:t>0.8272</w:t>
+              <w:t>0.8195</w:t>
             </w:r>
           </w:p>
         </w:tc>
@@ -5551,7 +5551,7 @@
                 <w:i w:val="0"/>
                 <w:sz w:val="20"/>
               </w:rPr>
-              <w:t>0.8158</w:t>
+              <w:t>0.7799</w:t>
             </w:r>
           </w:p>
         </w:tc>
@@ -5572,7 +5572,7 @@
                 <w:i w:val="0"/>
                 <w:sz w:val="20"/>
               </w:rPr>
-              <w:t>+0.0114</w:t>
+              <w:t>+0.0396</w:t>
             </w:r>
           </w:p>
         </w:tc>
@@ -5593,7 +5593,7 @@
                 <w:i w:val="0"/>
                 <w:sz w:val="20"/>
               </w:rPr>
-              <w:t>%38.0</w:t>
+              <w:t>%37.5</w:t>
             </w:r>
           </w:p>
         </w:tc>
@@ -5614,7 +5614,7 @@
                 <w:i w:val="0"/>
                 <w:sz w:val="20"/>
               </w:rPr>
-              <w:t>%35.4</w:t>
+              <w:t>%34.3</w:t>
             </w:r>
           </w:p>
         </w:tc>
@@ -5635,7 +5635,7 @@
                 <w:i w:val="0"/>
                 <w:sz w:val="20"/>
               </w:rPr>
-              <w:t>+%2.6</w:t>
+              <w:t>+%3.3</w:t>
             </w:r>
           </w:p>
         </w:tc>
@@ -5654,7 +5654,7 @@
           <w:i/>
           <w:sz w:val="20"/>
         </w:rPr>
-        <w:t>Ortalama ΔAUC (Is_Winner): +0.0137 (piyasa sinyalinin ortalama katkısı).</w:t>
+        <w:t>Ortalama ΔAUC (Is_Winner): +0.0252 (piyasa sinyalinin ortalama katkısı).</w:t>
       </w:r>
     </w:p>
     <w:tbl>
@@ -5863,7 +5863,7 @@
                 <w:i w:val="0"/>
                 <w:sz w:val="20"/>
               </w:rPr>
-              <w:t>XGBoost</w:t>
+              <w:t>StackingEnsemble</w:t>
             </w:r>
           </w:p>
         </w:tc>
@@ -5884,7 +5884,7 @@
                 <w:i w:val="0"/>
                 <w:sz w:val="20"/>
               </w:rPr>
-              <w:t>0.8158</w:t>
+              <w:t>0.8200</w:t>
             </w:r>
           </w:p>
         </w:tc>
@@ -5905,7 +5905,7 @@
                 <w:i w:val="0"/>
                 <w:sz w:val="20"/>
               </w:rPr>
-              <w:t>0.7950</w:t>
+              <w:t>0.8007</w:t>
             </w:r>
           </w:p>
         </w:tc>
@@ -5926,7 +5926,7 @@
                 <w:i w:val="0"/>
                 <w:sz w:val="20"/>
               </w:rPr>
-              <w:t>+0.0208</w:t>
+              <w:t>+0.0193</w:t>
             </w:r>
           </w:p>
         </w:tc>
@@ -5947,7 +5947,7 @@
                 <w:i w:val="0"/>
                 <w:sz w:val="20"/>
               </w:rPr>
-              <w:t>%73.2</w:t>
+              <w:t>%73.3</w:t>
             </w:r>
           </w:p>
         </w:tc>
@@ -5968,7 +5968,7 @@
                 <w:i w:val="0"/>
                 <w:sz w:val="20"/>
               </w:rPr>
-              <w:t>%69.6</w:t>
+              <w:t>%69.9</w:t>
             </w:r>
           </w:p>
         </w:tc>
@@ -5989,7 +5989,7 @@
                 <w:i w:val="0"/>
                 <w:sz w:val="20"/>
               </w:rPr>
-              <w:t>+%3.7</w:t>
+              <w:t>+%3.4</w:t>
             </w:r>
           </w:p>
         </w:tc>
@@ -6033,7 +6033,7 @@
                 <w:i w:val="0"/>
                 <w:sz w:val="20"/>
               </w:rPr>
-              <w:t>0.8149</w:t>
+              <w:t>0.8196</w:t>
             </w:r>
           </w:p>
         </w:tc>
@@ -6054,7 +6054,7 @@
                 <w:i w:val="0"/>
                 <w:sz w:val="20"/>
               </w:rPr>
-              <w:t>0.7940</w:t>
+              <w:t>0.7995</w:t>
             </w:r>
           </w:p>
         </w:tc>
@@ -6075,7 +6075,7 @@
                 <w:i w:val="0"/>
                 <w:sz w:val="20"/>
               </w:rPr>
-              <w:t>+0.0209</w:t>
+              <w:t>+0.0201</w:t>
             </w:r>
           </w:p>
         </w:tc>
@@ -6096,7 +6096,7 @@
                 <w:i w:val="0"/>
                 <w:sz w:val="20"/>
               </w:rPr>
-              <w:t>%71.4</w:t>
+              <w:t>%72.8</w:t>
             </w:r>
           </w:p>
         </w:tc>
@@ -6117,7 +6117,7 @@
                 <w:i w:val="0"/>
                 <w:sz w:val="20"/>
               </w:rPr>
-              <w:t>%68.9</w:t>
+              <w:t>%70.0</w:t>
             </w:r>
           </w:p>
         </w:tc>
@@ -6138,7 +6138,7 @@
                 <w:i w:val="0"/>
                 <w:sz w:val="20"/>
               </w:rPr>
-              <w:t>+%2.5</w:t>
+              <w:t>+%2.8</w:t>
             </w:r>
           </w:p>
         </w:tc>
@@ -6161,7 +6161,7 @@
                 <w:i w:val="0"/>
                 <w:sz w:val="20"/>
               </w:rPr>
-              <w:t>StackingEnsemble</w:t>
+              <w:t>CatBoost</w:t>
             </w:r>
           </w:p>
         </w:tc>
@@ -6182,7 +6182,7 @@
                 <w:i w:val="0"/>
                 <w:sz w:val="20"/>
               </w:rPr>
-              <w:t>0.8147</w:t>
+              <w:t>0.8195</w:t>
             </w:r>
           </w:p>
         </w:tc>
@@ -6203,7 +6203,7 @@
                 <w:i w:val="0"/>
                 <w:sz w:val="20"/>
               </w:rPr>
-              <w:t>0.7929</w:t>
+              <w:t>0.8015</w:t>
             </w:r>
           </w:p>
         </w:tc>
@@ -6224,7 +6224,7 @@
                 <w:i w:val="0"/>
                 <w:sz w:val="20"/>
               </w:rPr>
-              <w:t>+0.0218</w:t>
+              <w:t>+0.0180</w:t>
             </w:r>
           </w:p>
         </w:tc>
@@ -6245,7 +6245,7 @@
                 <w:i w:val="0"/>
                 <w:sz w:val="20"/>
               </w:rPr>
-              <w:t>%72.0</w:t>
+              <w:t>%73.1</w:t>
             </w:r>
           </w:p>
         </w:tc>
@@ -6266,7 +6266,7 @@
                 <w:i w:val="0"/>
                 <w:sz w:val="20"/>
               </w:rPr>
-              <w:t>%68.6</w:t>
+              <w:t>%70.8</w:t>
             </w:r>
           </w:p>
         </w:tc>
@@ -6287,7 +6287,7 @@
                 <w:i w:val="0"/>
                 <w:sz w:val="20"/>
               </w:rPr>
-              <w:t>+%3.4</w:t>
+              <w:t>+%2.3</w:t>
             </w:r>
           </w:p>
         </w:tc>
@@ -6310,7 +6310,7 @@
                 <w:i w:val="0"/>
                 <w:sz w:val="20"/>
               </w:rPr>
-              <w:t>CatBoost</w:t>
+              <w:t>VotingEnsemble</w:t>
             </w:r>
           </w:p>
         </w:tc>
@@ -6331,7 +6331,7 @@
                 <w:i w:val="0"/>
                 <w:sz w:val="20"/>
               </w:rPr>
-              <w:t>0.8146</w:t>
+              <w:t>0.8195</w:t>
             </w:r>
           </w:p>
         </w:tc>
@@ -6352,7 +6352,7 @@
                 <w:i w:val="0"/>
                 <w:sz w:val="20"/>
               </w:rPr>
-              <w:t>0.7940</w:t>
+              <w:t>0.7991</w:t>
             </w:r>
           </w:p>
         </w:tc>
@@ -6373,7 +6373,7 @@
                 <w:i w:val="0"/>
                 <w:sz w:val="20"/>
               </w:rPr>
-              <w:t>+0.0206</w:t>
+              <w:t>+0.0204</w:t>
             </w:r>
           </w:p>
         </w:tc>
@@ -6394,7 +6394,7 @@
                 <w:i w:val="0"/>
                 <w:sz w:val="20"/>
               </w:rPr>
-              <w:t>%73.0</w:t>
+              <w:t>%73.4</w:t>
             </w:r>
           </w:p>
         </w:tc>
@@ -6415,7 +6415,7 @@
                 <w:i w:val="0"/>
                 <w:sz w:val="20"/>
               </w:rPr>
-              <w:t>%69.3</w:t>
+              <w:t>%70.5</w:t>
             </w:r>
           </w:p>
         </w:tc>
@@ -6436,7 +6436,7 @@
                 <w:i w:val="0"/>
                 <w:sz w:val="20"/>
               </w:rPr>
-              <w:t>+%3.7</w:t>
+              <w:t>+%2.9</w:t>
             </w:r>
           </w:p>
         </w:tc>
@@ -6459,7 +6459,7 @@
                 <w:i w:val="0"/>
                 <w:sz w:val="20"/>
               </w:rPr>
-              <w:t>VotingEnsemble</w:t>
+              <w:t>XGBoost</w:t>
             </w:r>
           </w:p>
         </w:tc>
@@ -6480,7 +6480,7 @@
                 <w:i w:val="0"/>
                 <w:sz w:val="20"/>
               </w:rPr>
-              <w:t>0.8142</w:t>
+              <w:t>0.8194</w:t>
             </w:r>
           </w:p>
         </w:tc>
@@ -6501,7 +6501,7 @@
                 <w:i w:val="0"/>
                 <w:sz w:val="20"/>
               </w:rPr>
-              <w:t>0.7928</w:t>
+              <w:t>0.7992</w:t>
             </w:r>
           </w:p>
         </w:tc>
@@ -6522,7 +6522,7 @@
                 <w:i w:val="0"/>
                 <w:sz w:val="20"/>
               </w:rPr>
-              <w:t>+0.0214</w:t>
+              <w:t>+0.0202</w:t>
             </w:r>
           </w:p>
         </w:tc>
@@ -6543,7 +6543,7 @@
                 <w:i w:val="0"/>
                 <w:sz w:val="20"/>
               </w:rPr>
-              <w:t>%71.3</w:t>
+              <w:t>%73.0</w:t>
             </w:r>
           </w:p>
         </w:tc>
@@ -6564,7 +6564,7 @@
                 <w:i w:val="0"/>
                 <w:sz w:val="20"/>
               </w:rPr>
-              <w:t>%68.5</w:t>
+              <w:t>%70.3</w:t>
             </w:r>
           </w:p>
         </w:tc>
@@ -6585,7 +6585,7 @@
                 <w:i w:val="0"/>
                 <w:sz w:val="20"/>
               </w:rPr>
-              <w:t>+%2.8</w:t>
+              <w:t>+%2.7</w:t>
             </w:r>
           </w:p>
         </w:tc>
@@ -6608,7 +6608,7 @@
                 <w:i w:val="0"/>
                 <w:sz w:val="20"/>
               </w:rPr>
-              <w:t>GradientBoosting</w:t>
+              <w:t>BaggingLGBM</w:t>
             </w:r>
           </w:p>
         </w:tc>
@@ -6629,7 +6629,7 @@
                 <w:i w:val="0"/>
                 <w:sz w:val="20"/>
               </w:rPr>
-              <w:t>0.8126</w:t>
+              <w:t>0.8183</w:t>
             </w:r>
           </w:p>
         </w:tc>
@@ -6650,7 +6650,7 @@
                 <w:i w:val="0"/>
                 <w:sz w:val="20"/>
               </w:rPr>
-              <w:t>0.7929</w:t>
+              <w:t>0.7982</w:t>
             </w:r>
           </w:p>
         </w:tc>
@@ -6671,7 +6671,7 @@
                 <w:i w:val="0"/>
                 <w:sz w:val="20"/>
               </w:rPr>
-              <w:t>+0.0197</w:t>
+              <w:t>+0.0201</w:t>
             </w:r>
           </w:p>
         </w:tc>
@@ -6692,7 +6692,7 @@
                 <w:i w:val="0"/>
                 <w:sz w:val="20"/>
               </w:rPr>
-              <w:t>%72.1</w:t>
+              <w:t>%72.9</w:t>
             </w:r>
           </w:p>
         </w:tc>
@@ -6713,7 +6713,7 @@
                 <w:i w:val="0"/>
                 <w:sz w:val="20"/>
               </w:rPr>
-              <w:t>%68.8</w:t>
+              <w:t>%70.5</w:t>
             </w:r>
           </w:p>
         </w:tc>
@@ -6734,7 +6734,7 @@
                 <w:i w:val="0"/>
                 <w:sz w:val="20"/>
               </w:rPr>
-              <w:t>+%3.3</w:t>
+              <w:t>+%2.4</w:t>
             </w:r>
           </w:p>
         </w:tc>
@@ -6757,7 +6757,7 @@
                 <w:i w:val="0"/>
                 <w:sz w:val="20"/>
               </w:rPr>
-              <w:t>BaggingLGBM</w:t>
+              <w:t>GradientBoosting</w:t>
             </w:r>
           </w:p>
         </w:tc>
@@ -6778,7 +6778,7 @@
                 <w:i w:val="0"/>
                 <w:sz w:val="20"/>
               </w:rPr>
-              <w:t>0.8091</w:t>
+              <w:t>0.8104</w:t>
             </w:r>
           </w:p>
         </w:tc>
@@ -6799,7 +6799,7 @@
                 <w:i w:val="0"/>
                 <w:sz w:val="20"/>
               </w:rPr>
-              <w:t>0.7886</w:t>
+              <w:t>0.7872</w:t>
             </w:r>
           </w:p>
         </w:tc>
@@ -6820,7 +6820,7 @@
                 <w:i w:val="0"/>
                 <w:sz w:val="20"/>
               </w:rPr>
-              <w:t>+0.0205</w:t>
+              <w:t>+0.0232</w:t>
             </w:r>
           </w:p>
         </w:tc>
@@ -6841,7 +6841,7 @@
                 <w:i w:val="0"/>
                 <w:sz w:val="20"/>
               </w:rPr>
-              <w:t>%71.9</w:t>
+              <w:t>%72.2</w:t>
             </w:r>
           </w:p>
         </w:tc>
@@ -6862,7 +6862,7 @@
                 <w:i w:val="0"/>
                 <w:sz w:val="20"/>
               </w:rPr>
-              <w:t>%67.1</w:t>
+              <w:t>%69.5</w:t>
             </w:r>
           </w:p>
         </w:tc>
@@ -6883,7 +6883,7 @@
                 <w:i w:val="0"/>
                 <w:sz w:val="20"/>
               </w:rPr>
-              <w:t>+%4.8</w:t>
+              <w:t>+%2.7</w:t>
             </w:r>
           </w:p>
         </w:tc>
@@ -6927,7 +6927,7 @@
                 <w:i w:val="0"/>
                 <w:sz w:val="20"/>
               </w:rPr>
-              <w:t>0.8073</w:t>
+              <w:t>0.7983</w:t>
             </w:r>
           </w:p>
         </w:tc>
@@ -6948,7 +6948,7 @@
                 <w:i w:val="0"/>
                 <w:sz w:val="20"/>
               </w:rPr>
-              <w:t>0.7865</w:t>
+              <w:t>0.7735</w:t>
             </w:r>
           </w:p>
         </w:tc>
@@ -6969,7 +6969,7 @@
                 <w:i w:val="0"/>
                 <w:sz w:val="20"/>
               </w:rPr>
-              <w:t>+0.0208</w:t>
+              <w:t>+0.0248</w:t>
             </w:r>
           </w:p>
         </w:tc>
@@ -6990,7 +6990,7 @@
                 <w:i w:val="0"/>
                 <w:sz w:val="20"/>
               </w:rPr>
-              <w:t>%70.9</w:t>
+              <w:t>%71.0</w:t>
             </w:r>
           </w:p>
         </w:tc>
@@ -7011,7 +7011,7 @@
                 <w:i w:val="0"/>
                 <w:sz w:val="20"/>
               </w:rPr>
-              <w:t>%67.4</w:t>
+              <w:t>%67.0</w:t>
             </w:r>
           </w:p>
         </w:tc>
@@ -7032,7 +7032,7 @@
                 <w:i w:val="0"/>
                 <w:sz w:val="20"/>
               </w:rPr>
-              <w:t>+%3.4</w:t>
+              <w:t>+%4.0</w:t>
             </w:r>
           </w:p>
         </w:tc>
@@ -7076,7 +7076,7 @@
                 <w:i w:val="0"/>
                 <w:sz w:val="20"/>
               </w:rPr>
-              <w:t>0.7983</w:t>
+              <w:t>0.7913</w:t>
             </w:r>
           </w:p>
         </w:tc>
@@ -7097,7 +7097,7 @@
                 <w:i w:val="0"/>
                 <w:sz w:val="20"/>
               </w:rPr>
-              <w:t>0.7652</w:t>
+              <w:t>0.7530</w:t>
             </w:r>
           </w:p>
         </w:tc>
@@ -7118,7 +7118,7 @@
                 <w:i w:val="0"/>
                 <w:sz w:val="20"/>
               </w:rPr>
-              <w:t>+0.0331</w:t>
+              <w:t>+0.0383</w:t>
             </w:r>
           </w:p>
         </w:tc>
@@ -7139,7 +7139,7 @@
                 <w:i w:val="0"/>
                 <w:sz w:val="20"/>
               </w:rPr>
-              <w:t>%71.2</w:t>
+              <w:t>%70.2</w:t>
             </w:r>
           </w:p>
         </w:tc>
@@ -7160,7 +7160,7 @@
                 <w:i w:val="0"/>
                 <w:sz w:val="20"/>
               </w:rPr>
-              <w:t>%64.6</w:t>
+              <w:t>%66.3</w:t>
             </w:r>
           </w:p>
         </w:tc>
@@ -7181,7 +7181,7 @@
                 <w:i w:val="0"/>
                 <w:sz w:val="20"/>
               </w:rPr>
-              <w:t>+%6.5</w:t>
+              <w:t>+%3.8</w:t>
             </w:r>
           </w:p>
         </w:tc>
@@ -7200,7 +7200,7 @@
           <w:i/>
           <w:sz w:val="20"/>
         </w:rPr>
-        <w:t>Ortalama ΔAUC (Is_Top3): +0.0222 (piyasa sinyalinin ortalama katkısı).</w:t>
+        <w:t>Ortalama ΔAUC (Is_Top3): +0.0227 (piyasa sinyalinin ortalama katkısı).</w:t>
       </w:r>
     </w:p>
     <w:p>
@@ -7210,7 +7210,7 @@
       <w:r>
         <w:drawing>
           <wp:inline xmlns:a="http://schemas.openxmlformats.org/drawingml/2006/main" xmlns:pic="http://schemas.openxmlformats.org/drawingml/2006/picture">
-            <wp:extent cx="5040000" cy="2723695"/>
+            <wp:extent cx="5040000" cy="2721181"/>
             <wp:docPr id="3" name="Picture 3"/>
             <wp:cNvGraphicFramePr>
               <a:graphicFrameLocks noChangeAspect="1"/>
@@ -7231,7 +7231,7 @@
                   <pic:spPr>
                     <a:xfrm>
                       <a:off x="0" y="0"/>
-                      <a:ext cx="5040000" cy="2723695"/>
+                      <a:ext cx="5040000" cy="2721181"/>
                     </a:xfrm>
                     <a:prstGeom prst="rect"/>
                   </pic:spPr>
@@ -7338,7 +7338,7 @@
           <w:i w:val="0"/>
           <w:sz w:val="24"/>
         </w:rPr>
-        <w:t>17.923 at-koşu kaydı üzerindeki OOF olasılıkları incelendiğinde, Is_Winner tahminlerinin neredeyse kusursuz kalibre olduğu (Brier=0.0761, ECE=0.0054) görülmüştür. Buna karşın Is_Top3 tahminleri, üretim modelinde kullanılan sınıf-dengeleme (class-balancing) mekanizmaları nedeniyle yüksek-olasılık bölgesinde aşırı güvenli (over-confident) çıkmıştır (Brier=0.2630, ECE=0.3018); örneğin model %93.5 dediğinde gerçek isabet oranı yalnızca %71.2'dir (Tablo 7, Şekil 5-6). Bu bulgu, Is_Top3 olasılıklarının sıralama (ranking) amaçlı kullanım için güvenilir, ancak doğrudan beklenen-değer (EV) hesaplarına sokulmadan önce yeniden kalibre edilmesi gerektiğini ortaya koymaktadır.</w:t>
+        <w:t>60.713 at-koşu kaydı üzerindeki OOF olasılıkları incelendiğinde, Is_Winner tahminlerinin neredeyse kusursuz kalibre olduğu (Brier=0.0743, ECE=0.0075) görülmüştür. Buna karşın Is_Top3 tahminleri, üretim modelinde kullanılan sınıf-dengeleme (class-balancing) mekanizmaları nedeniyle yüksek-olasılık bölgesinde aşırı güvenli (over-confident) çıkmıştır (Brier=0.1730, ECE=0.1340); örneğin model %74.9 dediğinde gerçek isabet oranı yalnızca %58.4'tür (Tablo 7, Şekil 5-6). Bu nedenle üretim zincirine, OOF üzerinde öğrenilen izotonik (isotonic) regresyon kalibratörü eklenmiştir [12]: monoton olduğundan sıralama metriklerini (AUC, P@1) değiştirmez; kalibrasyon sonrası ECE her iki hedefte 0.000'a inmiş (Is_Top3 Brier 0.1730→0.1523), beklenen-değer (EV) hesapları gerçekçi olasılıklarla beslenir hale gelmiştir.</w:t>
       </w:r>
     </w:p>
     <w:tbl>
@@ -7348,17 +7348,18 @@
         <w:tblLook w:firstColumn="1" w:firstRow="1" w:lastColumn="0" w:lastRow="0" w:noHBand="0" w:noVBand="1" w:val="04A0"/>
       </w:tblPr>
       <w:tblGrid>
-        <w:gridCol w:w="1814"/>
-        <w:gridCol w:w="1814"/>
-        <w:gridCol w:w="1814"/>
-        <w:gridCol w:w="1814"/>
-        <w:gridCol w:w="1814"/>
+        <w:gridCol w:w="1512"/>
+        <w:gridCol w:w="1512"/>
+        <w:gridCol w:w="1512"/>
+        <w:gridCol w:w="1512"/>
+        <w:gridCol w:w="1512"/>
+        <w:gridCol w:w="1512"/>
       </w:tblGrid>
       <w:tr>
         <w:tc>
           <w:tcPr>
-            <w:tcW w:type="dxa" w:w="9070"/>
-            <w:gridSpan w:val="5"/>
+            <w:tcW w:type="dxa" w:w="9072"/>
+            <w:gridSpan w:val="6"/>
             <w:vAlign w:val="center"/>
           </w:tcPr>
           <w:p>
@@ -7373,7 +7374,7 @@
                 <w:i w:val="0"/>
                 <w:sz w:val="22"/>
               </w:rPr>
-              <w:t>Tablo 7: Olasılık Kalibrasyonu (OOF, 17.923 at-koşu kaydı)</w:t>
+              <w:t>Tablo 7: Olasılık Kalibrasyonu (OOF, 60.713 at-koşu kaydı)</w:t>
             </w:r>
           </w:p>
         </w:tc>
@@ -7381,7 +7382,7 @@
       <w:tr>
         <w:tc>
           <w:tcPr>
-            <w:tcW w:type="dxa" w:w="1814"/>
+            <w:tcW w:type="dxa" w:w="1512"/>
             <w:vAlign w:val="center"/>
           </w:tcPr>
           <w:p>
@@ -7402,7 +7403,7 @@
         </w:tc>
         <w:tc>
           <w:tcPr>
-            <w:tcW w:type="dxa" w:w="1814"/>
+            <w:tcW w:type="dxa" w:w="1512"/>
             <w:vAlign w:val="center"/>
           </w:tcPr>
           <w:p>
@@ -7417,13 +7418,13 @@
                 <w:i w:val="0"/>
                 <w:sz w:val="20"/>
               </w:rPr>
-              <w:t>Brier Skoru</w:t>
-            </w:r>
-          </w:p>
-        </w:tc>
-        <w:tc>
-          <w:tcPr>
-            <w:tcW w:type="dxa" w:w="1814"/>
+              <w:t>Brier (ham)</w:t>
+            </w:r>
+          </w:p>
+        </w:tc>
+        <w:tc>
+          <w:tcPr>
+            <w:tcW w:type="dxa" w:w="1512"/>
             <w:vAlign w:val="center"/>
           </w:tcPr>
           <w:p>
@@ -7438,13 +7439,13 @@
                 <w:i w:val="0"/>
                 <w:sz w:val="20"/>
               </w:rPr>
-              <w:t>ECE</w:t>
-            </w:r>
-          </w:p>
-        </w:tc>
-        <w:tc>
-          <w:tcPr>
-            <w:tcW w:type="dxa" w:w="1814"/>
+              <w:t>ECE (ham)</w:t>
+            </w:r>
+          </w:p>
+        </w:tc>
+        <w:tc>
+          <w:tcPr>
+            <w:tcW w:type="dxa" w:w="1512"/>
             <w:vAlign w:val="center"/>
           </w:tcPr>
           <w:p>
@@ -7459,13 +7460,34 @@
                 <w:i w:val="0"/>
                 <w:sz w:val="20"/>
               </w:rPr>
+              <w:t>ECE (isotonic)</w:t>
+            </w:r>
+          </w:p>
+        </w:tc>
+        <w:tc>
+          <w:tcPr>
+            <w:tcW w:type="dxa" w:w="1512"/>
+            <w:vAlign w:val="center"/>
+          </w:tcPr>
+          <w:p>
+            <w:pPr>
+              <w:jc w:val="center"/>
+            </w:pPr>
+            <w:r/>
+            <w:r>
+              <w:rPr>
+                <w:rFonts w:ascii="Times New Roman" w:hAnsi="Times New Roman"/>
+                <w:b/>
+                <w:i w:val="0"/>
+                <w:sz w:val="20"/>
+              </w:rPr>
               <w:t>Taban Oran</w:t>
             </w:r>
           </w:p>
         </w:tc>
         <w:tc>
           <w:tcPr>
-            <w:tcW w:type="dxa" w:w="1814"/>
+            <w:tcW w:type="dxa" w:w="1512"/>
             <w:vAlign w:val="center"/>
           </w:tcPr>
           <w:p>
@@ -7488,7 +7510,7 @@
       <w:tr>
         <w:tc>
           <w:tcPr>
-            <w:tcW w:type="dxa" w:w="1814"/>
+            <w:tcW w:type="dxa" w:w="1512"/>
             <w:vAlign w:val="center"/>
           </w:tcPr>
           <w:p>
@@ -7509,7 +7531,7 @@
         </w:tc>
         <w:tc>
           <w:tcPr>
-            <w:tcW w:type="dxa" w:w="1814"/>
+            <w:tcW w:type="dxa" w:w="1512"/>
             <w:vAlign w:val="center"/>
           </w:tcPr>
           <w:p>
@@ -7524,13 +7546,13 @@
                 <w:i w:val="0"/>
                 <w:sz w:val="20"/>
               </w:rPr>
-              <w:t>0.0761</w:t>
-            </w:r>
-          </w:p>
-        </w:tc>
-        <w:tc>
-          <w:tcPr>
-            <w:tcW w:type="dxa" w:w="1814"/>
+              <w:t>0.0743</w:t>
+            </w:r>
+          </w:p>
+        </w:tc>
+        <w:tc>
+          <w:tcPr>
+            <w:tcW w:type="dxa" w:w="1512"/>
             <w:vAlign w:val="center"/>
           </w:tcPr>
           <w:p>
@@ -7545,13 +7567,13 @@
                 <w:i w:val="0"/>
                 <w:sz w:val="20"/>
               </w:rPr>
-              <w:t>0.0054</w:t>
-            </w:r>
-          </w:p>
-        </w:tc>
-        <w:tc>
-          <w:tcPr>
-            <w:tcW w:type="dxa" w:w="1814"/>
+              <w:t>0.0075</w:t>
+            </w:r>
+          </w:p>
+        </w:tc>
+        <w:tc>
+          <w:tcPr>
+            <w:tcW w:type="dxa" w:w="1512"/>
             <w:vAlign w:val="center"/>
           </w:tcPr>
           <w:p>
@@ -7566,13 +7588,34 @@
                 <w:i w:val="0"/>
                 <w:sz w:val="20"/>
               </w:rPr>
-              <w:t>%10.2</w:t>
-            </w:r>
-          </w:p>
-        </w:tc>
-        <w:tc>
-          <w:tcPr>
-            <w:tcW w:type="dxa" w:w="1814"/>
+              <w:t>0.000</w:t>
+            </w:r>
+          </w:p>
+        </w:tc>
+        <w:tc>
+          <w:tcPr>
+            <w:tcW w:type="dxa" w:w="1512"/>
+            <w:vAlign w:val="center"/>
+          </w:tcPr>
+          <w:p>
+            <w:pPr>
+              <w:jc w:val="center"/>
+            </w:pPr>
+            <w:r/>
+            <w:r>
+              <w:rPr>
+                <w:rFonts w:ascii="Times New Roman" w:hAnsi="Times New Roman"/>
+                <w:b w:val="0"/>
+                <w:i w:val="0"/>
+                <w:sz w:val="20"/>
+              </w:rPr>
+              <w:t>%10.0</w:t>
+            </w:r>
+          </w:p>
+        </w:tc>
+        <w:tc>
+          <w:tcPr>
+            <w:tcW w:type="dxa" w:w="1512"/>
             <w:vAlign w:val="center"/>
           </w:tcPr>
           <w:p>
@@ -7595,7 +7638,7 @@
       <w:tr>
         <w:tc>
           <w:tcPr>
-            <w:tcW w:type="dxa" w:w="1814"/>
+            <w:tcW w:type="dxa" w:w="1512"/>
             <w:vAlign w:val="center"/>
           </w:tcPr>
           <w:p>
@@ -7616,7 +7659,7 @@
         </w:tc>
         <w:tc>
           <w:tcPr>
-            <w:tcW w:type="dxa" w:w="1814"/>
+            <w:tcW w:type="dxa" w:w="1512"/>
             <w:vAlign w:val="center"/>
           </w:tcPr>
           <w:p>
@@ -7631,13 +7674,13 @@
                 <w:i w:val="0"/>
                 <w:sz w:val="20"/>
               </w:rPr>
-              <w:t>0.2630</w:t>
-            </w:r>
-          </w:p>
-        </w:tc>
-        <w:tc>
-          <w:tcPr>
-            <w:tcW w:type="dxa" w:w="1814"/>
+              <w:t>0.1730</w:t>
+            </w:r>
+          </w:p>
+        </w:tc>
+        <w:tc>
+          <w:tcPr>
+            <w:tcW w:type="dxa" w:w="1512"/>
             <w:vAlign w:val="center"/>
           </w:tcPr>
           <w:p>
@@ -7652,13 +7695,13 @@
                 <w:i w:val="0"/>
                 <w:sz w:val="20"/>
               </w:rPr>
-              <w:t>0.3018</w:t>
-            </w:r>
-          </w:p>
-        </w:tc>
-        <w:tc>
-          <w:tcPr>
-            <w:tcW w:type="dxa" w:w="1814"/>
+              <w:t>0.1340</w:t>
+            </w:r>
+          </w:p>
+        </w:tc>
+        <w:tc>
+          <w:tcPr>
+            <w:tcW w:type="dxa" w:w="1512"/>
             <w:vAlign w:val="center"/>
           </w:tcPr>
           <w:p>
@@ -7673,13 +7716,13 @@
                 <w:i w:val="0"/>
                 <w:sz w:val="20"/>
               </w:rPr>
-              <w:t>%30.7</w:t>
-            </w:r>
-          </w:p>
-        </w:tc>
-        <w:tc>
-          <w:tcPr>
-            <w:tcW w:type="dxa" w:w="1814"/>
+              <w:t>0.000</w:t>
+            </w:r>
+          </w:p>
+        </w:tc>
+        <w:tc>
+          <w:tcPr>
+            <w:tcW w:type="dxa" w:w="1512"/>
             <w:vAlign w:val="center"/>
           </w:tcPr>
           <w:p>
@@ -7694,7 +7737,28 @@
                 <w:i w:val="0"/>
                 <w:sz w:val="20"/>
               </w:rPr>
-              <w:t>Aşırı güvenli (over-confident)</w:t>
+              <w:t>%30.1</w:t>
+            </w:r>
+          </w:p>
+        </w:tc>
+        <w:tc>
+          <w:tcPr>
+            <w:tcW w:type="dxa" w:w="1512"/>
+            <w:vAlign w:val="center"/>
+          </w:tcPr>
+          <w:p>
+            <w:pPr>
+              <w:jc w:val="center"/>
+            </w:pPr>
+            <w:r/>
+            <w:r>
+              <w:rPr>
+                <w:rFonts w:ascii="Times New Roman" w:hAnsi="Times New Roman"/>
+                <w:b w:val="0"/>
+                <w:i w:val="0"/>
+                <w:sz w:val="20"/>
+              </w:rPr>
+              <w:t>Aşırı güvenli → isotonic ile düzeltildi</w:t>
             </w:r>
           </w:p>
         </w:tc>
@@ -7836,7 +7900,7 @@
           <w:i w:val="0"/>
           <w:sz w:val="24"/>
         </w:rPr>
-        <w:t>1.830 koşuluk sızıntısız test kümesinde, modelin doğal seçiminin (olasılığa göre ilk-k) piyasanın doğal seçimine (favori sırası) kıyasla isabet oranı, herhangi bir ödeme varsayımı yapılmadan karşılaştırılmıştır (Tablo 8). Modelin altı bahis türünün tamamında piyasayı geçtiği ve farkın McNemar exact testiyle istatistiksel olarak anlamlı olduğu (p&lt;0.05) görülmüştür; en güçlü sonuç Ganyan'da elde edilmiştir (model %39.8 - piyasa %31.7, Δ=+8.1 puan, p=1.6×10⁻¹⁶). Yalnızca Ganyan bahsinde veride gerçek (piyasa-bağımsız) ödeme bilgisi bulunduğundan, bu türde dairesel olmayan tek güvenilir kasa simülasyonu kurulabilmiştir: 178 pozitif-EV bahisten %39.9 isabetle, flat strateji 1.000 TL'yi 3.350 TL'ye çıkarmıştır (ROI=+%132.1; Tablo 9, Şekil 7). Ancak aynı modelin canlı forward-test'inde (18 koşu, gerçek ödemelerle) Ganyan ROI'si yaklaşık -%36 olarak gözlenmiştir; bu fark, geçmiş OOF backtest'inin iyimser olabileceğini ve gerçek hakemin forward-test olduğunu göstermektedir. Egzotik bahis türleri (İkili, Sıralı İkili, Üçlü, Tabela) için geçmiş ödeme verisi bulunmadığından bu türlerin ROI'si yalnızca piyasa-ima yöntemiyle gösterge niteliğinde hesaplanabilmiş ve dairesel olduğu için literal TL değeri olarak yorumlanmamalıdır; bu türler için de McNemar sonucu (Tablo 8) tek dairesel-olmayan kanıttır.</w:t>
+        <w:t>6.085 koşuluk sızıntısız test kümesinde, modelin doğal seçiminin (olasılığa göre ilk-k) piyasanın doğal seçimine (favori sırası) kıyasla isabet oranı, herhangi bir ödeme varsayımı yapılmadan karşılaştırılmıştır (Tablo 8). Model altı bahis türünün tamamında piyasayı sayısal olarak geçmiş, fark beş türde McNemar exact testiyle istatistiksel olarak anlamlı bulunmuştur (p&lt;0.05; tek istisna en seyrek isabet eden Tabela, p=0.33); en güçlü sonuç Ganyan'da elde edilmiştir (model %39.0 - piyasa %32.2, Δ=+6.7 puan, p=9.6×10⁻³²). Yalnızca Ganyan bahsinde veride gerçek (piyasa-bağımsız) ödeme bilgisi bulunduğundan, bu türde dairesel olmayan tek güvenilir kasa simülasyonu kurulabilmiştir: 707 pozitif-EV bahisten %36.1 isabetle, flat strateji 1.000 TL'yi 10.016 TL'ye çıkarmıştır (stake başına ROI=+%127.5; Tablo 9, Şekil 7). Ancak modelin önceki sürümünün canlı forward-test'inde (18 koşu, gerçek ödemelerle) Ganyan ROI'si yaklaşık -%36 olarak gözlenmiştir; bu fark, geçmiş OOF backtest'inin iyimser olabileceğini ve gerçek hakemin forward-test olduğunu göstermektedir (bu revizyonla forward-test sayacı temiz koşullarda yeniden başlatılmıştır). Egzotik bahis türleri (İkili, Sıralı İkili, Üçlü, Tabela) için geçmiş ödeme verisi bulunmadığından bu türlerin ROI'si yalnızca piyasa-ima yöntemiyle gösterge niteliğinde hesaplanabilmiş ve dairesel olduğu için literal TL değeri olarak yorumlanmamalıdır; bu türler için de McNemar sonucu (Tablo 8) tek dairesel-olmayan kanıttır.</w:t>
       </w:r>
     </w:p>
     <w:tbl>
@@ -7871,7 +7935,7 @@
                 <w:i w:val="0"/>
                 <w:sz w:val="22"/>
               </w:rPr>
-              <w:t>Tablo 8: Model vs Piyasa Seçim İsabeti — McNemar Exact Testi (n=1.830 koşu)</w:t>
+              <w:t>Tablo 8: Model vs Piyasa Seçim İsabeti — McNemar Exact Testi (n=6.085 koşu)</w:t>
             </w:r>
           </w:p>
         </w:tc>
@@ -8022,7 +8086,7 @@
                 <w:i w:val="0"/>
                 <w:sz w:val="20"/>
               </w:rPr>
-              <w:t>%39.8</w:t>
+              <w:t>%39.0</w:t>
             </w:r>
           </w:p>
         </w:tc>
@@ -8043,7 +8107,7 @@
                 <w:i w:val="0"/>
                 <w:sz w:val="20"/>
               </w:rPr>
-              <w:t>%31.7</w:t>
+              <w:t>%32.2</w:t>
             </w:r>
           </w:p>
         </w:tc>
@@ -8064,7 +8128,7 @@
                 <w:i w:val="0"/>
                 <w:sz w:val="20"/>
               </w:rPr>
-              <w:t>+8.1</w:t>
+              <w:t>+6.7</w:t>
             </w:r>
           </w:p>
         </w:tc>
@@ -8085,7 +8149,7 @@
                 <w:i w:val="0"/>
                 <w:sz w:val="20"/>
               </w:rPr>
-              <w:t>1.6×10⁻¹⁶</w:t>
+              <w:t>9.6×10⁻³²</w:t>
             </w:r>
           </w:p>
         </w:tc>
@@ -8108,7 +8172,7 @@
                 <w:i w:val="0"/>
                 <w:sz w:val="20"/>
               </w:rPr>
-              <w:t>İkili</w:t>
+              <w:t>Plase</w:t>
             </w:r>
           </w:p>
         </w:tc>
@@ -8129,7 +8193,7 @@
                 <w:i w:val="0"/>
                 <w:sz w:val="20"/>
               </w:rPr>
-              <w:t>%22.1</w:t>
+              <w:t>%74.9</w:t>
             </w:r>
           </w:p>
         </w:tc>
@@ -8150,7 +8214,7 @@
                 <w:i w:val="0"/>
                 <w:sz w:val="20"/>
               </w:rPr>
-              <w:t>%16.4</w:t>
+              <w:t>%68.6</w:t>
             </w:r>
           </w:p>
         </w:tc>
@@ -8171,7 +8235,7 @@
                 <w:i w:val="0"/>
                 <w:sz w:val="20"/>
               </w:rPr>
-              <w:t>+5.7</w:t>
+              <w:t>+6.3</w:t>
             </w:r>
           </w:p>
         </w:tc>
@@ -8192,7 +8256,7 @@
                 <w:i w:val="0"/>
                 <w:sz w:val="20"/>
               </w:rPr>
-              <w:t>1.1×10⁻¹⁰</w:t>
+              <w:t>7.3×10⁻³⁰</w:t>
             </w:r>
           </w:p>
         </w:tc>
@@ -8215,7 +8279,7 @@
                 <w:i w:val="0"/>
                 <w:sz w:val="20"/>
               </w:rPr>
-              <w:t>Sıralı İkili</w:t>
+              <w:t>İkili</w:t>
             </w:r>
           </w:p>
         </w:tc>
@@ -8236,7 +8300,7 @@
                 <w:i w:val="0"/>
                 <w:sz w:val="20"/>
               </w:rPr>
-              <w:t>%14.6</w:t>
+              <w:t>%20.8</w:t>
             </w:r>
           </w:p>
         </w:tc>
@@ -8257,7 +8321,7 @@
                 <w:i w:val="0"/>
                 <w:sz w:val="20"/>
               </w:rPr>
-              <w:t>%9.6</w:t>
+              <w:t>%17.0</w:t>
             </w:r>
           </w:p>
         </w:tc>
@@ -8278,7 +8342,7 @@
                 <w:i w:val="0"/>
                 <w:sz w:val="20"/>
               </w:rPr>
-              <w:t>+5.0</w:t>
+              <w:t>+3.8</w:t>
             </w:r>
           </w:p>
         </w:tc>
@@ -8299,7 +8363,7 @@
                 <w:i w:val="0"/>
                 <w:sz w:val="20"/>
               </w:rPr>
-              <w:t>2.5×10⁻¹⁰</w:t>
+              <w:t>1.5×10⁻¹⁴</w:t>
             </w:r>
           </w:p>
         </w:tc>
@@ -8322,7 +8386,7 @@
                 <w:i w:val="0"/>
                 <w:sz w:val="20"/>
               </w:rPr>
-              <w:t>Plase</w:t>
+              <w:t>Sıralı İkili</w:t>
             </w:r>
           </w:p>
         </w:tc>
@@ -8343,7 +8407,7 @@
                 <w:i w:val="0"/>
                 <w:sz w:val="20"/>
               </w:rPr>
-              <w:t>%73.0</w:t>
+              <w:t>%12.0</w:t>
             </w:r>
           </w:p>
         </w:tc>
@@ -8364,7 +8428,7 @@
                 <w:i w:val="0"/>
                 <w:sz w:val="20"/>
               </w:rPr>
-              <w:t>%68.3</w:t>
+              <w:t>%9.3</w:t>
             </w:r>
           </w:p>
         </w:tc>
@@ -8385,7 +8449,7 @@
                 <w:i w:val="0"/>
                 <w:sz w:val="20"/>
               </w:rPr>
-              <w:t>+4.7</w:t>
+              <w:t>+2.7</w:t>
             </w:r>
           </w:p>
         </w:tc>
@@ -8406,7 +8470,7 @@
                 <w:i w:val="0"/>
                 <w:sz w:val="20"/>
               </w:rPr>
-              <w:t>1.9×10⁻⁶</w:t>
+              <w:t>6.0×10⁻¹⁰</w:t>
             </w:r>
           </w:p>
         </w:tc>
@@ -8450,7 +8514,7 @@
                 <w:i w:val="0"/>
                 <w:sz w:val="20"/>
               </w:rPr>
-              <w:t>%4.0</w:t>
+              <w:t>%3.6</w:t>
             </w:r>
           </w:p>
         </w:tc>
@@ -8471,7 +8535,7 @@
                 <w:i w:val="0"/>
                 <w:sz w:val="20"/>
               </w:rPr>
-              <w:t>%2.7</w:t>
+              <w:t>%2.9</w:t>
             </w:r>
           </w:p>
         </w:tc>
@@ -8492,7 +8556,7 @@
                 <w:i w:val="0"/>
                 <w:sz w:val="20"/>
               </w:rPr>
-              <w:t>+1.3</w:t>
+              <w:t>+0.6</w:t>
             </w:r>
           </w:p>
         </w:tc>
@@ -8513,7 +8577,7 @@
                 <w:i w:val="0"/>
                 <w:sz w:val="20"/>
               </w:rPr>
-              <w:t>1.4×10⁻²</w:t>
+              <w:t>1.6×10⁻²</w:t>
             </w:r>
           </w:p>
         </w:tc>
@@ -8557,7 +8621,7 @@
                 <w:i w:val="0"/>
                 <w:sz w:val="20"/>
               </w:rPr>
-              <w:t>%1.6</w:t>
+              <w:t>%1.3</w:t>
             </w:r>
           </w:p>
         </w:tc>
@@ -8578,7 +8642,7 @@
                 <w:i w:val="0"/>
                 <w:sz w:val="20"/>
               </w:rPr>
-              <w:t>%0.9</w:t>
+              <w:t>%1.1</w:t>
             </w:r>
           </w:p>
         </w:tc>
@@ -8599,7 +8663,7 @@
                 <w:i w:val="0"/>
                 <w:sz w:val="20"/>
               </w:rPr>
-              <w:t>+0.7</w:t>
+              <w:t>+0.2</w:t>
             </w:r>
           </w:p>
         </w:tc>
@@ -8620,7 +8684,7 @@
                 <w:i w:val="0"/>
                 <w:sz w:val="20"/>
               </w:rPr>
-              <w:t>4.1×10⁻²</w:t>
+              <w:t>3.3×10⁻¹ (anlamsız)</w:t>
             </w:r>
           </w:p>
         </w:tc>
@@ -8701,7 +8765,7 @@
                 <w:i w:val="0"/>
                 <w:sz w:val="20"/>
               </w:rPr>
-              <w:t>Backtest (OOF, 178 bahis)</w:t>
+              <w:t>Backtest (OOF, 707 bahis)</w:t>
             </w:r>
           </w:p>
         </w:tc>
@@ -8722,7 +8786,7 @@
                 <w:i w:val="0"/>
                 <w:sz w:val="20"/>
               </w:rPr>
-              <w:t>Canlı Forward-Test (18 koşu)</w:t>
+              <w:t>Canlı Forward-Test (önceki sürüm, 18 koşu)</w:t>
             </w:r>
           </w:p>
         </w:tc>
@@ -8766,7 +8830,7 @@
                 <w:i w:val="0"/>
                 <w:sz w:val="20"/>
               </w:rPr>
-              <w:t>%39.9</w:t>
+              <w:t>%36.1</w:t>
             </w:r>
           </w:p>
         </w:tc>
@@ -8831,7 +8895,7 @@
                 <w:i w:val="0"/>
                 <w:sz w:val="20"/>
               </w:rPr>
-              <w:t>+%132.1 (1.000→3.350 TL)</w:t>
+              <w:t>+%127.5 (1.000→10.016 TL)</w:t>
             </w:r>
           </w:p>
         </w:tc>
@@ -8917,7 +8981,7 @@
                 <w:i w:val="0"/>
                 <w:sz w:val="20"/>
               </w:rPr>
-              <w:t>Gerçek hakem</w:t>
+              <w:t>Gerçek hakem (v2 ile sıfırdan başlatıldı)</w:t>
             </w:r>
           </w:p>
         </w:tc>
@@ -9251,7 +9315,7 @@
           <w:i w:val="0"/>
           <w:sz w:val="24"/>
         </w:rPr>
-        <w:t>Bu çalışmada, at performanslarının tahmini amacıyla kullanılan kolektif öğrenme modellerinin, sızıntısız (TimeSeriesSplit) bir metodolojiyle değerlendirildiğinde de hipodrom istatistiklerine uyarlanabilir, ticari ve istatistiksel olarak savunulabilir bir avantaj sunduğu üç ayrı kanıt hattıyla gösterilmiştir: (i) piyasa sinyali çıkarıldığında AUC'nin yalnızca 0.01-0.02 düşmesi, modelin gücünün büyük ölçüde kendi özellik mühendisliğinden geldiğini; (ii) McNemar testlerinin altı bahis türünün tamamında modelin piyasayı istatistiksel olarak anlamlı şekilde geçtiğini (p&lt;0.05, çoğunlukla p&lt;0.001) kanıtlamıştır. Bununla birlikte kalibrasyon analizi ve canlı forward-test sonuçları, ham olasılıkların -özellikle Is_Top3 ve egzotik bahis EV hesaplarında- doğrudan kullanılmadan önce isotonic/Platt yöntemleriyle yeniden kalibre edilmesi gerektiğini göstermiştir; bu, çalışmanın bir sonraki adımı olarak planlanmaktadır. Ayrıca kurulan VPS tabanlı canlı zamanlayıcı (live scheduler) sayesinde günlük forward-test verisi sürekli birikmekte, modelin gerçek-dünya performansı zamanla daha güvenilir örneklem büyüklüğüyle değerlendirilebilecektir. Sonuç olarak ML yöntemlerinin, doğruluk payı yüksek ve istatistiksel olarak doğrulanmış karar destek sistemlerine hizmet edebileceği; ancak gerçek bahis uygulamalarında yüksek varyans ve kalibrasyon gereksinimleri nedeniyle temkinli yaklaşılması gerektiği ortaya konmuştur.</w:t>
+        <w:t>Bu çalışmada, at performanslarının tahmini amacıyla kullanılan kolektif öğrenme modellerinin, sızıntısız (TimeSeriesSplit) bir metodolojiyle değerlendirildiğinde de hipodrom istatistiklerine uyarlanabilir, ticari ve istatistiksel olarak savunulabilir bir avantaj sunduğu üç ayrı kanıt hattıyla gösterilmiştir: (i) piyasa sinyali çıkarıldığında AUC'nin yalnızca ~0.02 düşmesi, modelin gücünün büyük ölçüde kendi özellik mühendisliğinden geldiğini; (ii) McNemar testlerinin altı bahis türünün beşinde modelin piyasayı istatistiksel olarak anlamlı şekilde geçtiğini (p&lt;0.05, çoğunlukla p&lt;0.001) kanıtlamıştır. Kalibrasyon analizinin ortaya koyduğu Is_Top3 aşırı-güven sorunu, üretim zincirine eklenen isotonic kalibrasyonla giderilmiş (ECE 0.134→0.000); ayrıca saf-fundamental model olasılığı ile piyasa-ima olasılığını ikinci aşama lojistik regresyonda birleştiren Benter [10] harmanı üçüncü tahmin varyantı olarak eklenmiştir (α_model=0.73, β_piyasa=0.53 — iki katsayının da sıfırdan uzaklığı, model ile piyasanın birbirini kapsamayan bilgi taşıdığını gösterir). Ayrıca kurulan VPS tabanlı canlı zamanlayıcı (live scheduler) sayesinde günlük forward-test verisi sürekli birikmekte, modelin gerçek-dünya performansı zamanla daha güvenilir örneklem büyüklüğüyle değerlendirilebilecektir. Sonuç olarak ML yöntemlerinin, doğruluk payı yüksek ve istatistiksel olarak doğrulanmış karar destek sistemlerine hizmet edebileceği; ancak gerçek bahis uygulamalarında yüksek varyans ve kalibrasyon gereksinimleri nedeniyle temkinli yaklaşılması gerektiği ortaya konmuştur.</w:t>
       </w:r>
     </w:p>
     <w:p>

</xml_diff>